<commit_message>
update paper with JAMIA format
</commit_message>
<xml_diff>
--- a/Paper/JAMIA/JAMIA_Manuscript.docx
+++ b/Paper/JAMIA/JAMIA_Manuscript.docx
@@ -255,7 +255,7 @@
           <w:szCs w:val="24"/>
           <w:rtl w:val="0"/>
         </w:rPr>
-        <w:t xml:space="preserve">The Department of Biomedical and Health Informatics, The Children’s Hospital of Philadelphia, Philadelphia PA</w:t>
+        <w:t xml:space="preserve">The Department of Biomedical and Health Informatics, The Children’s Hospital of Philadelphia, Philadelphia PA, USA</w:t>
       </w:r>
     </w:p>
     <w:p>
@@ -292,7 +292,7 @@
           <w:szCs w:val="24"/>
           <w:rtl w:val="0"/>
         </w:rPr>
-        <w:t xml:space="preserve">Department of Pathology &amp; Laboratory Medicine, Children's Hospital of Philadelphia, Philadelphia PA</w:t>
+        <w:t xml:space="preserve">Department of Pathology &amp; Laboratory Medicine, Children's Hospital of Philadelphia, Philadelphia PA, USA</w:t>
       </w:r>
     </w:p>
     <w:p>
@@ -329,7 +329,7 @@
           <w:szCs w:val="24"/>
           <w:rtl w:val="0"/>
         </w:rPr>
-        <w:t xml:space="preserve">Department of Pediatrics, University of Pennsylvania Perelman Medical School, Philadelphia PA </w:t>
+        <w:t xml:space="preserve">Department of Pediatrics, University of Pennsylvania Perelman Medical School, Philadelphia PA, USA</w:t>
       </w:r>
     </w:p>
     <w:p>
@@ -350,6 +350,49 @@
         <w:rPr>
           <w:rtl w:val="0"/>
         </w:rPr>
+      </w:r>
+    </w:p>
+    <w:p>
+      <w:pPr>
+        <w:keepNext w:val="0"/>
+        <w:keepLines w:val="0"/>
+        <w:pageBreakBefore w:val="0"/>
+        <w:widowControl w:val="1"/>
+        <w:pBdr>
+          <w:top w:space="0" w:sz="0" w:val="nil"/>
+          <w:left w:space="0" w:sz="0" w:val="nil"/>
+          <w:bottom w:space="0" w:sz="0" w:val="nil"/>
+          <w:right w:space="0" w:sz="0" w:val="nil"/>
+          <w:between w:space="0" w:sz="0" w:val="nil"/>
+        </w:pBdr>
+        <w:shd w:fill="auto" w:val="clear"/>
+        <w:spacing w:after="0" w:before="0" w:line="276" w:lineRule="auto"/>
+        <w:ind w:left="0" w:right="0" w:firstLine="0"/>
+        <w:jc w:val="both"/>
+        <w:rPr>
+          <w:rFonts w:ascii="Times New Roman" w:cs="Times New Roman" w:eastAsia="Times New Roman" w:hAnsi="Times New Roman"/>
+          <w:sz w:val="24"/>
+          <w:szCs w:val="24"/>
+        </w:rPr>
+      </w:pPr>
+      <w:r>
+        <w:rPr>
+          <w:rFonts w:ascii="Times New Roman" w:cs="Times New Roman" w:eastAsia="Times New Roman" w:hAnsi="Times New Roman"/>
+          <w:b w:val="1"/>
+          <w:sz w:val="24"/>
+          <w:szCs w:val="24"/>
+          <w:rtl w:val="0"/>
+        </w:rPr>
+        <w:t xml:space="preserve">Word Count: </w:t>
+      </w:r>
+      <w:r>
+        <w:rPr>
+          <w:rFonts w:ascii="Times New Roman" w:cs="Times New Roman" w:eastAsia="Times New Roman" w:hAnsi="Times New Roman"/>
+          <w:sz w:val="24"/>
+          <w:szCs w:val="24"/>
+          <w:rtl w:val="0"/>
+        </w:rPr>
+        <w:t xml:space="preserve">4608</w:t>
       </w:r>
     </w:p>
     <w:p>
@@ -4709,7 +4752,7 @@
           <w:szCs w:val="24"/>
           <w:rtl w:val="0"/>
         </w:rPr>
-        <w:t xml:space="preserve">), we prioritized combinations with high prediction diversity (low agreement) rather than testing all options. This increases the chance that at least one method will correctly standardize a name when others fail.</w:t>
+        <w:t xml:space="preserve">) for either edition of the WHO system, we prioritized combinations with high prediction diversity (low agreement) rather than testing all options. This increases the chance that at least one method will correctly standardize a name when others fail.</w:t>
       </w:r>
       <w:r>
         <w:rPr>
@@ -4985,48 +5028,7 @@
           <w:highlight w:val="white"/>
           <w:rtl w:val="0"/>
         </w:rPr>
-        <w:t xml:space="preserve">CANTOS extracted 13,230 tumor names from the CTR, of which 6,324 were classified as pediatric. To evaluate standardization methods, we randomly selected 1,600 tumor names and manually annotated them using two WHO-based reference standards (ground truths): the WHO-5th and a combined WHO-all</w:t>
-      </w:r>
-      <w:r>
-        <w:rPr>
-          <w:rFonts w:ascii="Times New Roman" w:cs="Times New Roman" w:eastAsia="Times New Roman" w:hAnsi="Times New Roman"/>
-          <w:sz w:val="24"/>
-          <w:szCs w:val="24"/>
-          <w:highlight w:val="white"/>
-          <w:vertAlign w:val="superscript"/>
-          <w:rtl w:val="0"/>
-        </w:rPr>
-        <w:t xml:space="preserve"> </w:t>
-      </w:r>
-      <w:r>
-        <w:rPr>
-          <w:rFonts w:ascii="Times New Roman" w:cs="Times New Roman" w:eastAsia="Times New Roman" w:hAnsi="Times New Roman"/>
-          <w:sz w:val="24"/>
-          <w:szCs w:val="24"/>
-          <w:highlight w:val="white"/>
-          <w:rtl w:val="0"/>
-        </w:rPr>
-        <w:t xml:space="preserve">set (includes 3rd, 4th, 5th editions</w:t>
-      </w:r>
-      <w:r>
-        <w:rPr>
-          <w:rFonts w:ascii="Times New Roman" w:cs="Times New Roman" w:eastAsia="Times New Roman" w:hAnsi="Times New Roman"/>
-          <w:sz w:val="28"/>
-          <w:szCs w:val="28"/>
-          <w:highlight w:val="white"/>
-          <w:rtl w:val="0"/>
-        </w:rPr>
-        <w:t xml:space="preserve">)</w:t>
-      </w:r>
-      <w:r>
-        <w:rPr>
-          <w:rFonts w:ascii="Times New Roman" w:cs="Times New Roman" w:eastAsia="Times New Roman" w:hAnsi="Times New Roman"/>
-          <w:sz w:val="24"/>
-          <w:szCs w:val="24"/>
-          <w:highlight w:val="white"/>
-          <w:rtl w:val="0"/>
-        </w:rPr>
-        <w:t xml:space="preserve">. We limited the manual annotations for evaluation to the WHO system (NCIt was excluded) as it is considered a clinical standard for tumor nomenclature. </w:t>
+        <w:t xml:space="preserve">CANTOS extracted 13,230 tumor names from the CTR, of which 6,324 were classified as pediatric. To evaluate standardization methods, we randomly selected 1,600 tumor names and manually annotated them using two editions of the WHO system (ground truths): the WHO-5th and WHO-all. We limited the manual annotations for evaluation to the WHO system (NCIt was excluded) as it is considered a clinical standard for tumor nomenclature. </w:t>
       </w:r>
     </w:p>
     <w:p>
@@ -5063,7 +5065,7 @@
           <w:szCs w:val="24"/>
           <w:rtl w:val="0"/>
         </w:rPr>
-        <w:t xml:space="preserve">Some CTR tumor names had multiple or no ground truth matches in the WHO system. Names with multiple matches were included in accuracy evaluation; those without were excluded. Thus, accuracy was evaluated on 1,044 CTR terms for WHO-5th and 1,118 CTR terms for WHO-all. Standardization accuracy calculated as the proportion correctly mapped to at least one ground truth term (</w:t>
+        <w:t xml:space="preserve">Some CTR tumor names had multiple or no ground truth matches in the WHO system. Names with multiple ground truths were included in accuracy evaluation; those without were excluded. Thus, accuracy was evaluated on 1,044 CTR terms for WHO-5th and 1,118 CTR terms for WHO-all. Standardization accuracy was calculated as the proportion correctly mapped to at least one ground truth term (</w:t>
       </w:r>
       <w:r>
         <w:rPr>
@@ -5101,7 +5103,7 @@
           <w:szCs w:val="24"/>
           <w:rtl w:val="0"/>
         </w:rPr>
-        <w:t xml:space="preserve">).Several text-embedding methods outperformed text-matching, across both WHO editions. Though, models such as PubMedBERT, BioBERT, SciBERT, ModernBERT, MedLlama, Llama, Phi-4, and DeepSeek_8B performed comparably or worse than text-matching. Among text-matching approaches, Levenshtein distance consistently outperformed more complex edit distance metrics Jarro-Winkler and cosine, likely due to its ability to capture minimal edits while preserving word order.</w:t>
+        <w:t xml:space="preserve">). Several text-embedding methods outperformed text-matching, across both WHO editions. Though, models such as PubMedBERT, BioBERT, SciBERT, ModernBERT, MedLlama, Llama, Phi-4, and DeepSeek_8B performed comparably or worse than text-matching. Among text-matching approaches, Levenshtein distance consistently outperformed more complex edit distance metrics Jarro-Winkler and cosine, likely due to its ability to capture minimal edits while preserving word order.</w:t>
       </w:r>
     </w:p>
     <w:p>
@@ -5138,7 +5140,7 @@
           <w:szCs w:val="24"/>
           <w:rtl w:val="0"/>
         </w:rPr>
-        <w:t xml:space="preserve">Among text-embedding methods, LTE-3+Euclidean Dist achieved the highest accuracy of 69.3%  when standardizing the CTR tumor names against WHO-all. Whereas, for WHO-5th, all-MiniLM-L12-v2+Euclidean Dist achieves the highest standardization accuracy of 67.8%. For either editions of the WHO system,  methods based e5-large, LTE-3, ADA-002, all-mpnet-base-v2, all-MiniLM-L12-v2, all-MiniLM-L6-v2 and nomic, achieve standardization accuracies above 60%.  Variation in accuracy of text-embedding methods can be attributed to various factors like model architecture, training data, domain specialization, and embedding dimensions.</w:t>
+        <w:t xml:space="preserve">Among text-embedding methods, LTE-3+Euclidean Dist achieved the highest accuracy of 69.3%  when standardizing the sampled CTR tumor names against WHO-all. Whereas, for WHO-5th, all-MiniLM-L12-v2+Euclidean Dist achieves the highest standardization accuracy of 67.8%. For either editions of the WHO system,  methods based e5-large, LTE-3, ADA-002, all-mpnet-base-v2, all-MiniLM-L12-v2, all-MiniLM-L6-v2 and nomic, achieve standardization accuracies above 60%.  Variation in accuracy of text-embedding methods can be attributed to differences in model architecture, training data, domain specialization, and embedding dimensions.</w:t>
       </w:r>
     </w:p>
     <w:p>
@@ -5367,7 +5369,7 @@
           <w:szCs w:val="24"/>
           <w:rtl w:val="0"/>
         </w:rPr>
-        <w:t xml:space="preserve">, offering insights into using distance thresholds to assess standardization reliability in CANTOS. For example, using LTE-3+Euclidean Dist with WHO-5th, the median distance for correct standardizations is 0.696, and 0.8408 for incorrect ones (</w:t>
+        <w:t xml:space="preserve">, offering insights into using distance thresholds to assess standardization reliability in CANTOS. For example, using LTE-3+Euclidean Dist against WHO-5th, the median distance for correct standardizations is 0.696, and 0.8408 for incorrect ones (</w:t>
       </w:r>
       <w:r>
         <w:rPr>
@@ -5424,7 +5426,7 @@
           <w:szCs w:val="24"/>
           <w:rtl w:val="0"/>
         </w:rPr>
-        <w:t xml:space="preserve">, underscores the need for higher-quality text embeddings that would yield greater class distribution differences. Such embeddings would also reduce the number of incorrect standardizations, thereby improving standardization accuracy.</w:t>
+        <w:t xml:space="preserve">, underscores the need for higher-quality text embeddings that would yield greater separation between class distributions. Such embeddings would consequently reduce the number of incorrect standardizations, thereby improving standardization accuracy.</w:t>
       </w:r>
     </w:p>
     <w:p>
@@ -5525,7 +5527,7 @@
           <w:szCs w:val="24"/>
           <w:rtl w:val="0"/>
         </w:rPr>
-        <w:t xml:space="preserve"> pairwise mutual information (AMI)  to maximize prediction diversity via majority vote. For WHO-5th, ADA-002+AP, LTE-3+K-means, and all-MiniLM-L12-v2+Euclidean Dist had the lowest AMI achieved 72.1% accuracy, whereas for WHO-all combining ADA-002+K-means, LTE-3+K-means, and all-MiniLM-L12-v2+Euclidean Dist had the lowest AMI and achieved a 71.4% standardization accuracy. In contrast, using all eleven high-accuracy methods in a majority vote led to decline in accuracy: 44.2% (WHO-5th) and 48.4% (WHO-all).</w:t>
+        <w:t xml:space="preserve"> pairwise mutual information (AMI)  to maximize prediction diversity via majority vote. Against WHO-5th, ADA-002+AP, LTE-3+K-means, and all-MiniLM-L12-v2+Euclidean Dist had the lowest AMI achieved 72.1% accuracy, whereas for WHO-all combining ADA-002+K-means, LTE-3+K-means, and all-MiniLM-L12-v2+Euclidean Dist had the lowest AMI and achieved a 71.4% standardization accuracy. In contrast, using all eleven high-accuracy methods in a majority vote led to decline in accuracy: 44.2% (WHO-5th) and 48.4% (WHO-all).</w:t>
       </w:r>
     </w:p>
     <w:p>
@@ -5662,27 +5664,15 @@
     </w:p>
     <w:p>
       <w:pPr>
+        <w:spacing w:line="276.0005454545455" w:lineRule="auto"/>
         <w:ind w:left="-540" w:firstLine="0"/>
-        <w:rPr>
-          <w:rFonts w:ascii="Times New Roman" w:cs="Times New Roman" w:eastAsia="Times New Roman" w:hAnsi="Times New Roman"/>
-          <w:b w:val="1"/>
-          <w:color w:val="2a2a2a"/>
-          <w:sz w:val="28"/>
-          <w:szCs w:val="28"/>
-          <w:highlight w:val="white"/>
+        <w:jc w:val="both"/>
+        <w:rPr>
+          <w:rFonts w:ascii="Times New Roman" w:cs="Times New Roman" w:eastAsia="Times New Roman" w:hAnsi="Times New Roman"/>
+          <w:sz w:val="24"/>
+          <w:szCs w:val="24"/>
         </w:rPr>
       </w:pPr>
-      <w:r>
-        <w:rPr>
-          <w:rFonts w:ascii="Times New Roman" w:cs="Times New Roman" w:eastAsia="Times New Roman" w:hAnsi="Times New Roman"/>
-          <w:b w:val="1"/>
-          <w:sz w:val="28"/>
-          <w:szCs w:val="28"/>
-          <w:highlight w:val="white"/>
-          <w:rtl w:val="0"/>
-        </w:rPr>
-        <w:t xml:space="preserve">Discussion</w:t>
-      </w:r>
       <w:r>
         <w:rPr>
           <w:rtl w:val="0"/>
@@ -5696,132 +5686,43 @@
         <w:jc w:val="both"/>
         <w:rPr>
           <w:rFonts w:ascii="Times New Roman" w:cs="Times New Roman" w:eastAsia="Times New Roman" w:hAnsi="Times New Roman"/>
-          <w:color w:val="2a2a2a"/>
           <w:sz w:val="24"/>
           <w:szCs w:val="24"/>
         </w:rPr>
       </w:pPr>
       <w:r>
         <w:rPr>
-          <w:rFonts w:ascii="Times New Roman" w:cs="Times New Roman" w:eastAsia="Times New Roman" w:hAnsi="Times New Roman"/>
-          <w:color w:val="2a2a2a"/>
-          <w:sz w:val="24"/>
-          <w:szCs w:val="24"/>
-          <w:rtl w:val="0"/>
-        </w:rPr>
-        <w:t xml:space="preserve">CANTOS identifies tumor names from CTR and applies several methods  to standardize them. </w:t>
-      </w:r>
-      <w:r>
-        <w:rPr>
-          <w:rFonts w:ascii="Times New Roman" w:cs="Times New Roman" w:eastAsia="Times New Roman" w:hAnsi="Times New Roman"/>
-          <w:sz w:val="24"/>
-          <w:szCs w:val="24"/>
-          <w:highlight w:val="white"/>
-          <w:rtl w:val="0"/>
-        </w:rPr>
-        <w:t xml:space="preserve">While data submission guidelines exist, there are no enforced standards for tumor names in the conditions file. Prior studies have stressed standardization in trial design </w:t>
-      </w:r>
-      <w:hyperlink r:id="rId73">
-        <w:r>
-          <w:rPr>
-            <w:rFonts w:ascii="Times New Roman" w:cs="Times New Roman" w:eastAsia="Times New Roman" w:hAnsi="Times New Roman"/>
-            <w:b w:val="0"/>
-            <w:color w:val="000000"/>
-            <w:sz w:val="24"/>
-            <w:szCs w:val="24"/>
-            <w:highlight w:val="white"/>
-            <w:u w:val="none"/>
-            <w:rtl w:val="0"/>
-          </w:rPr>
-          <w:t xml:space="preserve">[126,127]</w:t>
-        </w:r>
-      </w:hyperlink>
-      <w:r>
-        <w:rPr>
-          <w:rFonts w:ascii="Times New Roman" w:cs="Times New Roman" w:eastAsia="Times New Roman" w:hAnsi="Times New Roman"/>
-          <w:sz w:val="24"/>
-          <w:szCs w:val="24"/>
-          <w:highlight w:val="white"/>
-          <w:rtl w:val="0"/>
-        </w:rPr>
-        <w:t xml:space="preserve"> and reproducibility</w:t>
-      </w:r>
-      <w:hyperlink r:id="rId74">
-        <w:r>
-          <w:rPr>
-            <w:rFonts w:ascii="Times New Roman" w:cs="Times New Roman" w:eastAsia="Times New Roman" w:hAnsi="Times New Roman"/>
-            <w:b w:val="0"/>
-            <w:color w:val="000000"/>
-            <w:sz w:val="24"/>
-            <w:szCs w:val="24"/>
-            <w:highlight w:val="white"/>
-            <w:u w:val="none"/>
-            <w:rtl w:val="0"/>
-          </w:rPr>
-          <w:t xml:space="preserve">[128]</w:t>
-        </w:r>
-      </w:hyperlink>
-      <w:r>
-        <w:rPr>
-          <w:rFonts w:ascii="Times New Roman" w:cs="Times New Roman" w:eastAsia="Times New Roman" w:hAnsi="Times New Roman"/>
-          <w:sz w:val="24"/>
-          <w:szCs w:val="24"/>
-          <w:highlight w:val="white"/>
-          <w:rtl w:val="0"/>
-        </w:rPr>
-        <w:t xml:space="preserve">, but not for tumor nomenclature. </w:t>
-      </w:r>
-      <w:r>
-        <w:rPr>
-          <w:rFonts w:ascii="Times New Roman" w:cs="Times New Roman" w:eastAsia="Times New Roman" w:hAnsi="Times New Roman"/>
-          <w:color w:val="2a2a2a"/>
-          <w:sz w:val="24"/>
-          <w:szCs w:val="24"/>
-          <w:rtl w:val="0"/>
-        </w:rPr>
-        <w:t xml:space="preserve"> CANTOS </w:t>
-      </w:r>
-      <w:r>
-        <w:rPr>
-          <w:rFonts w:ascii="Times New Roman" w:cs="Times New Roman" w:eastAsia="Times New Roman" w:hAnsi="Times New Roman"/>
-          <w:color w:val="2a2a2a"/>
-          <w:sz w:val="24"/>
-          <w:szCs w:val="24"/>
-          <w:highlight w:val="white"/>
-          <w:rtl w:val="0"/>
-        </w:rPr>
-        <w:t xml:space="preserve">tested</w:t>
-      </w:r>
-      <w:r>
-        <w:rPr>
-          <w:rFonts w:ascii="Times New Roman" w:cs="Times New Roman" w:eastAsia="Times New Roman" w:hAnsi="Times New Roman"/>
-          <w:color w:val="2a2a2a"/>
-          <w:sz w:val="24"/>
-          <w:szCs w:val="24"/>
-          <w:rtl w:val="0"/>
-        </w:rPr>
-        <w:t xml:space="preserve"> 36 standardization methods based on text-matching and embeddings. To assess accuracy,</w:t>
-      </w:r>
-      <w:r>
+          <w:rtl w:val="0"/>
+        </w:rPr>
+      </w:r>
+    </w:p>
+    <w:p>
+      <w:pPr>
+        <w:ind w:left="-540" w:firstLine="0"/>
         <w:rPr>
           <w:rFonts w:ascii="Times New Roman" w:cs="Times New Roman" w:eastAsia="Times New Roman" w:hAnsi="Times New Roman"/>
           <w:b w:val="1"/>
           <w:color w:val="2a2a2a"/>
-          <w:sz w:val="24"/>
-          <w:szCs w:val="24"/>
-          <w:rtl w:val="0"/>
-        </w:rPr>
-        <w:t xml:space="preserve"> </w:t>
-      </w:r>
-      <w:r>
-        <w:rPr>
-          <w:rFonts w:ascii="Times New Roman" w:cs="Times New Roman" w:eastAsia="Times New Roman" w:hAnsi="Times New Roman"/>
-          <w:color w:val="2a2a2a"/>
-          <w:sz w:val="24"/>
-          <w:szCs w:val="24"/>
-          <w:rtl w:val="0"/>
-        </w:rPr>
-        <w:t xml:space="preserve">1,600 names were randomly sampled and manually annotated using WHO-5th and WHO-all.</w:t>
+          <w:sz w:val="28"/>
+          <w:szCs w:val="28"/>
+          <w:highlight w:val="white"/>
+        </w:rPr>
+      </w:pPr>
+      <w:r>
+        <w:rPr>
+          <w:rFonts w:ascii="Times New Roman" w:cs="Times New Roman" w:eastAsia="Times New Roman" w:hAnsi="Times New Roman"/>
+          <w:b w:val="1"/>
+          <w:sz w:val="28"/>
+          <w:szCs w:val="28"/>
+          <w:highlight w:val="white"/>
+          <w:rtl w:val="0"/>
+        </w:rPr>
+        <w:t xml:space="preserve">Discussion</w:t>
+      </w:r>
+      <w:r>
+        <w:rPr>
+          <w:rtl w:val="0"/>
+        </w:rPr>
       </w:r>
     </w:p>
     <w:p>
@@ -5838,8 +5739,125 @@
       </w:pPr>
       <w:r>
         <w:rPr>
-          <w:rtl w:val="0"/>
-        </w:rPr>
+          <w:rFonts w:ascii="Times New Roman" w:cs="Times New Roman" w:eastAsia="Times New Roman" w:hAnsi="Times New Roman"/>
+          <w:color w:val="2a2a2a"/>
+          <w:sz w:val="24"/>
+          <w:szCs w:val="24"/>
+          <w:rtl w:val="0"/>
+        </w:rPr>
+        <w:t xml:space="preserve">CANTOS identifies tumor names from CTR and applies several methods  to standardize them. </w:t>
+      </w:r>
+      <w:r>
+        <w:rPr>
+          <w:rFonts w:ascii="Times New Roman" w:cs="Times New Roman" w:eastAsia="Times New Roman" w:hAnsi="Times New Roman"/>
+          <w:sz w:val="24"/>
+          <w:szCs w:val="24"/>
+          <w:highlight w:val="white"/>
+          <w:rtl w:val="0"/>
+        </w:rPr>
+        <w:t xml:space="preserve">While data submission guidelines exist, there are no enforced standards for tumor names in the conditions file. Prior studies have stressed standardization in trial design </w:t>
+      </w:r>
+      <w:hyperlink r:id="rId73">
+        <w:r>
+          <w:rPr>
+            <w:rFonts w:ascii="Times New Roman" w:cs="Times New Roman" w:eastAsia="Times New Roman" w:hAnsi="Times New Roman"/>
+            <w:b w:val="0"/>
+            <w:color w:val="000000"/>
+            <w:sz w:val="24"/>
+            <w:szCs w:val="24"/>
+            <w:highlight w:val="white"/>
+            <w:u w:val="none"/>
+            <w:rtl w:val="0"/>
+          </w:rPr>
+          <w:t xml:space="preserve">[126,127]</w:t>
+        </w:r>
+      </w:hyperlink>
+      <w:r>
+        <w:rPr>
+          <w:rFonts w:ascii="Times New Roman" w:cs="Times New Roman" w:eastAsia="Times New Roman" w:hAnsi="Times New Roman"/>
+          <w:sz w:val="24"/>
+          <w:szCs w:val="24"/>
+          <w:highlight w:val="white"/>
+          <w:rtl w:val="0"/>
+        </w:rPr>
+        <w:t xml:space="preserve"> and reproducibility</w:t>
+      </w:r>
+      <w:hyperlink r:id="rId74">
+        <w:r>
+          <w:rPr>
+            <w:rFonts w:ascii="Times New Roman" w:cs="Times New Roman" w:eastAsia="Times New Roman" w:hAnsi="Times New Roman"/>
+            <w:b w:val="0"/>
+            <w:color w:val="000000"/>
+            <w:sz w:val="24"/>
+            <w:szCs w:val="24"/>
+            <w:highlight w:val="white"/>
+            <w:u w:val="none"/>
+            <w:rtl w:val="0"/>
+          </w:rPr>
+          <w:t xml:space="preserve">[128]</w:t>
+        </w:r>
+      </w:hyperlink>
+      <w:r>
+        <w:rPr>
+          <w:rFonts w:ascii="Times New Roman" w:cs="Times New Roman" w:eastAsia="Times New Roman" w:hAnsi="Times New Roman"/>
+          <w:sz w:val="24"/>
+          <w:szCs w:val="24"/>
+          <w:highlight w:val="white"/>
+          <w:rtl w:val="0"/>
+        </w:rPr>
+        <w:t xml:space="preserve">, but not for tumor nomenclature. </w:t>
+      </w:r>
+      <w:r>
+        <w:rPr>
+          <w:rFonts w:ascii="Times New Roman" w:cs="Times New Roman" w:eastAsia="Times New Roman" w:hAnsi="Times New Roman"/>
+          <w:color w:val="2a2a2a"/>
+          <w:sz w:val="24"/>
+          <w:szCs w:val="24"/>
+          <w:rtl w:val="0"/>
+        </w:rPr>
+        <w:t xml:space="preserve"> CANTOS </w:t>
+      </w:r>
+      <w:r>
+        <w:rPr>
+          <w:rFonts w:ascii="Times New Roman" w:cs="Times New Roman" w:eastAsia="Times New Roman" w:hAnsi="Times New Roman"/>
+          <w:color w:val="2a2a2a"/>
+          <w:sz w:val="24"/>
+          <w:szCs w:val="24"/>
+          <w:highlight w:val="white"/>
+          <w:rtl w:val="0"/>
+        </w:rPr>
+        <w:t xml:space="preserve">tested</w:t>
+      </w:r>
+      <w:r>
+        <w:rPr>
+          <w:rFonts w:ascii="Times New Roman" w:cs="Times New Roman" w:eastAsia="Times New Roman" w:hAnsi="Times New Roman"/>
+          <w:color w:val="2a2a2a"/>
+          <w:sz w:val="24"/>
+          <w:szCs w:val="24"/>
+          <w:rtl w:val="0"/>
+        </w:rPr>
+        <w:t xml:space="preserve"> 36 standardization methods based on text-matching and text-embeddings. To assess accuracy,</w:t>
+      </w:r>
+      <w:r>
+        <w:rPr>
+          <w:rFonts w:ascii="Times New Roman" w:cs="Times New Roman" w:eastAsia="Times New Roman" w:hAnsi="Times New Roman"/>
+          <w:b w:val="1"/>
+          <w:color w:val="2a2a2a"/>
+          <w:sz w:val="24"/>
+          <w:szCs w:val="24"/>
+          <w:rtl w:val="0"/>
+        </w:rPr>
+        <w:t xml:space="preserve"> </w:t>
+      </w:r>
+      <w:r>
+        <w:rPr>
+          <w:rFonts w:ascii="Times New Roman" w:cs="Times New Roman" w:eastAsia="Times New Roman" w:hAnsi="Times New Roman"/>
+          <w:color w:val="2a2a2a"/>
+          <w:sz w:val="24"/>
+          <w:szCs w:val="24"/>
+          <w:rtl w:val="0"/>
+        </w:rPr>
+        <w:t xml:space="preserve">1,600 names were randomly sampled and manually annotated using WHO-5th and WHO-all.</w:t>
       </w:r>
     </w:p>
     <w:p>
@@ -5856,112 +5874,8 @@
       </w:pPr>
       <w:r>
         <w:rPr>
-          <w:rFonts w:ascii="Times New Roman" w:cs="Times New Roman" w:eastAsia="Times New Roman" w:hAnsi="Times New Roman"/>
-          <w:color w:val="2a2a2a"/>
-          <w:sz w:val="24"/>
-          <w:szCs w:val="24"/>
-          <w:rtl w:val="0"/>
-        </w:rPr>
-        <w:t xml:space="preserve">Text-matching methods achieved standardization accuracies of 21.6% – 30.3% (WHO</w:t>
-      </w:r>
-      <w:r>
-        <w:rPr>
-          <w:rFonts w:ascii="Times New Roman" w:cs="Times New Roman" w:eastAsia="Times New Roman" w:hAnsi="Times New Roman"/>
-          <w:sz w:val="24"/>
-          <w:szCs w:val="24"/>
-          <w:rtl w:val="0"/>
-        </w:rPr>
-        <w:t xml:space="preserve">-</w:t>
-      </w:r>
-      <w:r>
-        <w:rPr>
-          <w:rFonts w:ascii="Times New Roman" w:cs="Times New Roman" w:eastAsia="Times New Roman" w:hAnsi="Times New Roman"/>
-          <w:color w:val="2a2a2a"/>
-          <w:sz w:val="24"/>
-          <w:szCs w:val="24"/>
-          <w:rtl w:val="0"/>
-        </w:rPr>
-        <w:t xml:space="preserve">5th) and 22.7% – 32.6% (WHO</w:t>
-      </w:r>
-      <w:r>
-        <w:rPr>
-          <w:rFonts w:ascii="Times New Roman" w:cs="Times New Roman" w:eastAsia="Times New Roman" w:hAnsi="Times New Roman"/>
-          <w:sz w:val="24"/>
-          <w:szCs w:val="24"/>
-          <w:rtl w:val="0"/>
-        </w:rPr>
-        <w:t xml:space="preserve">-</w:t>
-      </w:r>
-      <w:r>
-        <w:rPr>
-          <w:rFonts w:ascii="Times New Roman" w:cs="Times New Roman" w:eastAsia="Times New Roman" w:hAnsi="Times New Roman"/>
-          <w:color w:val="2a2a2a"/>
-          <w:sz w:val="24"/>
-          <w:szCs w:val="24"/>
-          <w:rtl w:val="0"/>
-        </w:rPr>
-        <w:t xml:space="preserve">all). Consequently, all text-matching based  methods were classified as low-accuracy methods. In contrast, text-embedding methods showed a wider accuracy range from 13.7% – 67.8% (WHO</w:t>
-      </w:r>
-      <w:r>
-        <w:rPr>
-          <w:rFonts w:ascii="Times New Roman" w:cs="Times New Roman" w:eastAsia="Times New Roman" w:hAnsi="Times New Roman"/>
-          <w:sz w:val="24"/>
-          <w:szCs w:val="24"/>
-          <w:rtl w:val="0"/>
-        </w:rPr>
-        <w:t xml:space="preserve">-</w:t>
-      </w:r>
-      <w:r>
-        <w:rPr>
-          <w:rFonts w:ascii="Times New Roman" w:cs="Times New Roman" w:eastAsia="Times New Roman" w:hAnsi="Times New Roman"/>
-          <w:color w:val="2a2a2a"/>
-          <w:sz w:val="24"/>
-          <w:szCs w:val="24"/>
-          <w:rtl w:val="0"/>
-        </w:rPr>
-        <w:t xml:space="preserve">5th) and 15.4% – 69.1% (WHO-all). While text-matching captures only syntactic differences, embeddings capture both syntax and semantics, which explains the superior performance of some models. However, not all embedding methods outperformed text-matching; performance varied significantly by model. Despite this variance, rankings of text-embedding based methods remained consistent across both WHO editions (</w:t>
-      </w:r>
-      <w:r>
-        <w:rPr>
-          <w:rFonts w:ascii="Times New Roman" w:cs="Times New Roman" w:eastAsia="Times New Roman" w:hAnsi="Times New Roman"/>
-          <w:b w:val="1"/>
-          <w:color w:val="2a2a2a"/>
-          <w:sz w:val="24"/>
-          <w:szCs w:val="24"/>
-          <w:rtl w:val="0"/>
-        </w:rPr>
-        <w:t xml:space="preserve">Tables 1</w:t>
-      </w:r>
-      <w:r>
-        <w:rPr>
-          <w:rFonts w:ascii="Times New Roman" w:cs="Times New Roman" w:eastAsia="Times New Roman" w:hAnsi="Times New Roman"/>
-          <w:color w:val="2a2a2a"/>
-          <w:sz w:val="24"/>
-          <w:szCs w:val="24"/>
-          <w:rtl w:val="0"/>
-        </w:rPr>
-        <w:t xml:space="preserve"> and </w:t>
-      </w:r>
-      <w:r>
-        <w:rPr>
-          <w:rFonts w:ascii="Times New Roman" w:cs="Times New Roman" w:eastAsia="Times New Roman" w:hAnsi="Times New Roman"/>
-          <w:b w:val="1"/>
-          <w:color w:val="2a2a2a"/>
-          <w:sz w:val="24"/>
-          <w:szCs w:val="24"/>
-          <w:rtl w:val="0"/>
-        </w:rPr>
-        <w:t xml:space="preserve">2</w:t>
-      </w:r>
-      <w:r>
-        <w:rPr>
-          <w:rFonts w:ascii="Times New Roman" w:cs="Times New Roman" w:eastAsia="Times New Roman" w:hAnsi="Times New Roman"/>
-          <w:color w:val="2a2a2a"/>
-          <w:sz w:val="24"/>
-          <w:szCs w:val="24"/>
-          <w:rtl w:val="0"/>
-        </w:rPr>
-        <w:t xml:space="preserve">).</w:t>
+          <w:rtl w:val="0"/>
+        </w:rPr>
       </w:r>
     </w:p>
     <w:p>
@@ -5978,8 +5892,112 @@
       </w:pPr>
       <w:r>
         <w:rPr>
-          <w:rtl w:val="0"/>
-        </w:rPr>
+          <w:rFonts w:ascii="Times New Roman" w:cs="Times New Roman" w:eastAsia="Times New Roman" w:hAnsi="Times New Roman"/>
+          <w:color w:val="2a2a2a"/>
+          <w:sz w:val="24"/>
+          <w:szCs w:val="24"/>
+          <w:rtl w:val="0"/>
+        </w:rPr>
+        <w:t xml:space="preserve">Text-matching methods achieved standardization accuracies of 21.6% – 30.3% (WHO</w:t>
+      </w:r>
+      <w:r>
+        <w:rPr>
+          <w:rFonts w:ascii="Times New Roman" w:cs="Times New Roman" w:eastAsia="Times New Roman" w:hAnsi="Times New Roman"/>
+          <w:sz w:val="24"/>
+          <w:szCs w:val="24"/>
+          <w:rtl w:val="0"/>
+        </w:rPr>
+        <w:t xml:space="preserve">-</w:t>
+      </w:r>
+      <w:r>
+        <w:rPr>
+          <w:rFonts w:ascii="Times New Roman" w:cs="Times New Roman" w:eastAsia="Times New Roman" w:hAnsi="Times New Roman"/>
+          <w:color w:val="2a2a2a"/>
+          <w:sz w:val="24"/>
+          <w:szCs w:val="24"/>
+          <w:rtl w:val="0"/>
+        </w:rPr>
+        <w:t xml:space="preserve">5th) and 22.7% – 32.6% (WHO</w:t>
+      </w:r>
+      <w:r>
+        <w:rPr>
+          <w:rFonts w:ascii="Times New Roman" w:cs="Times New Roman" w:eastAsia="Times New Roman" w:hAnsi="Times New Roman"/>
+          <w:sz w:val="24"/>
+          <w:szCs w:val="24"/>
+          <w:rtl w:val="0"/>
+        </w:rPr>
+        <w:t xml:space="preserve">-</w:t>
+      </w:r>
+      <w:r>
+        <w:rPr>
+          <w:rFonts w:ascii="Times New Roman" w:cs="Times New Roman" w:eastAsia="Times New Roman" w:hAnsi="Times New Roman"/>
+          <w:color w:val="2a2a2a"/>
+          <w:sz w:val="24"/>
+          <w:szCs w:val="24"/>
+          <w:rtl w:val="0"/>
+        </w:rPr>
+        <w:t xml:space="preserve">all). Consequently, all text-matching based  methods were classified as low-accuracy methods. In contrast, text-embedding methods showed a wider accuracy range from 13.7% – 67.8% (WHO</w:t>
+      </w:r>
+      <w:r>
+        <w:rPr>
+          <w:rFonts w:ascii="Times New Roman" w:cs="Times New Roman" w:eastAsia="Times New Roman" w:hAnsi="Times New Roman"/>
+          <w:sz w:val="24"/>
+          <w:szCs w:val="24"/>
+          <w:rtl w:val="0"/>
+        </w:rPr>
+        <w:t xml:space="preserve">-</w:t>
+      </w:r>
+      <w:r>
+        <w:rPr>
+          <w:rFonts w:ascii="Times New Roman" w:cs="Times New Roman" w:eastAsia="Times New Roman" w:hAnsi="Times New Roman"/>
+          <w:color w:val="2a2a2a"/>
+          <w:sz w:val="24"/>
+          <w:szCs w:val="24"/>
+          <w:rtl w:val="0"/>
+        </w:rPr>
+        <w:t xml:space="preserve">5th) and 15.4% – 69.1% (WHO-all). While text-matching captures only syntactic differences, embeddings capture both syntax and semantics, which explains the superior performance of some models. However, not all embedding methods outperformed text-matching; performance varied significantly by model. Despite this variance, rankings of text-embedding based methods remained consistent across both WHO editions (</w:t>
+      </w:r>
+      <w:r>
+        <w:rPr>
+          <w:rFonts w:ascii="Times New Roman" w:cs="Times New Roman" w:eastAsia="Times New Roman" w:hAnsi="Times New Roman"/>
+          <w:b w:val="1"/>
+          <w:color w:val="2a2a2a"/>
+          <w:sz w:val="24"/>
+          <w:szCs w:val="24"/>
+          <w:rtl w:val="0"/>
+        </w:rPr>
+        <w:t xml:space="preserve">Tables 1</w:t>
+      </w:r>
+      <w:r>
+        <w:rPr>
+          <w:rFonts w:ascii="Times New Roman" w:cs="Times New Roman" w:eastAsia="Times New Roman" w:hAnsi="Times New Roman"/>
+          <w:color w:val="2a2a2a"/>
+          <w:sz w:val="24"/>
+          <w:szCs w:val="24"/>
+          <w:rtl w:val="0"/>
+        </w:rPr>
+        <w:t xml:space="preserve"> and </w:t>
+      </w:r>
+      <w:r>
+        <w:rPr>
+          <w:rFonts w:ascii="Times New Roman" w:cs="Times New Roman" w:eastAsia="Times New Roman" w:hAnsi="Times New Roman"/>
+          <w:b w:val="1"/>
+          <w:color w:val="2a2a2a"/>
+          <w:sz w:val="24"/>
+          <w:szCs w:val="24"/>
+          <w:rtl w:val="0"/>
+        </w:rPr>
+        <w:t xml:space="preserve">2</w:t>
+      </w:r>
+      <w:r>
+        <w:rPr>
+          <w:rFonts w:ascii="Times New Roman" w:cs="Times New Roman" w:eastAsia="Times New Roman" w:hAnsi="Times New Roman"/>
+          <w:color w:val="2a2a2a"/>
+          <w:sz w:val="24"/>
+          <w:szCs w:val="24"/>
+          <w:rtl w:val="0"/>
+        </w:rPr>
+        <w:t xml:space="preserve">).</w:t>
       </w:r>
     </w:p>
     <w:p>
@@ -5996,203 +6014,8 @@
       </w:pPr>
       <w:r>
         <w:rPr>
-          <w:rFonts w:ascii="Times New Roman" w:cs="Times New Roman" w:eastAsia="Times New Roman" w:hAnsi="Times New Roman"/>
-          <w:color w:val="2a2a2a"/>
-          <w:sz w:val="24"/>
-          <w:szCs w:val="24"/>
-          <w:rtl w:val="0"/>
-        </w:rPr>
-        <w:t xml:space="preserve">When standardizing against either WHO-5th or WHO-all, methods based on text-embeddings generated from the models LTE-3, ADA-002, </w:t>
-      </w:r>
-      <w:r>
-        <w:rPr>
-          <w:rFonts w:ascii="Times New Roman" w:cs="Times New Roman" w:eastAsia="Times New Roman" w:hAnsi="Times New Roman"/>
-          <w:sz w:val="24"/>
-          <w:szCs w:val="24"/>
-          <w:rtl w:val="0"/>
-        </w:rPr>
-        <w:t xml:space="preserve">all-MiniLM-L12-v2</w:t>
-      </w:r>
-      <w:r>
-        <w:rPr>
-          <w:rFonts w:ascii="Times New Roman" w:cs="Times New Roman" w:eastAsia="Times New Roman" w:hAnsi="Times New Roman"/>
-          <w:color w:val="2a2a2a"/>
-          <w:sz w:val="24"/>
-          <w:szCs w:val="24"/>
-          <w:rtl w:val="0"/>
-        </w:rPr>
-        <w:t xml:space="preserve">, </w:t>
-      </w:r>
-      <w:r>
-        <w:rPr>
-          <w:rFonts w:ascii="Times New Roman" w:cs="Times New Roman" w:eastAsia="Times New Roman" w:hAnsi="Times New Roman"/>
-          <w:sz w:val="24"/>
-          <w:szCs w:val="24"/>
-          <w:rtl w:val="0"/>
-        </w:rPr>
-        <w:t xml:space="preserve">all-MiniLM-L6-v2</w:t>
-      </w:r>
-      <w:r>
-        <w:rPr>
-          <w:rFonts w:ascii="Times New Roman" w:cs="Times New Roman" w:eastAsia="Times New Roman" w:hAnsi="Times New Roman"/>
-          <w:color w:val="2a2a2a"/>
-          <w:sz w:val="24"/>
-          <w:szCs w:val="24"/>
-          <w:rtl w:val="0"/>
-        </w:rPr>
-        <w:t xml:space="preserve">, </w:t>
-      </w:r>
-      <w:r>
-        <w:rPr>
-          <w:rFonts w:ascii="Times New Roman" w:cs="Times New Roman" w:eastAsia="Times New Roman" w:hAnsi="Times New Roman"/>
-          <w:sz w:val="24"/>
-          <w:szCs w:val="24"/>
-          <w:rtl w:val="0"/>
-        </w:rPr>
-        <w:t xml:space="preserve">e5-large</w:t>
-      </w:r>
-      <w:r>
-        <w:rPr>
-          <w:rFonts w:ascii="Times New Roman" w:cs="Times New Roman" w:eastAsia="Times New Roman" w:hAnsi="Times New Roman"/>
-          <w:color w:val="2a2a2a"/>
-          <w:sz w:val="24"/>
-          <w:szCs w:val="24"/>
-          <w:rtl w:val="0"/>
-        </w:rPr>
-        <w:t xml:space="preserve">, </w:t>
-      </w:r>
-      <w:r>
-        <w:rPr>
-          <w:rFonts w:ascii="Times New Roman" w:cs="Times New Roman" w:eastAsia="Times New Roman" w:hAnsi="Times New Roman"/>
-          <w:sz w:val="24"/>
-          <w:szCs w:val="24"/>
-          <w:rtl w:val="0"/>
-        </w:rPr>
-        <w:t xml:space="preserve">all-mpnet-base-v2</w:t>
-      </w:r>
-      <w:r>
-        <w:rPr>
-          <w:rFonts w:ascii="Times New Roman" w:cs="Times New Roman" w:eastAsia="Times New Roman" w:hAnsi="Times New Roman"/>
-          <w:color w:val="2a2a2a"/>
-          <w:sz w:val="24"/>
-          <w:szCs w:val="24"/>
-          <w:rtl w:val="0"/>
-        </w:rPr>
-        <w:t xml:space="preserve">, and nomic achieved a minimum standardization accuracy of at least 60.2% and were consequently classified as high-accuracy methods. The highest standardization accuracy is obtained by the methods LTE-3+Euclidean Dist when standardizing against WHO-all and by </w:t>
-      </w:r>
-      <w:r>
-        <w:rPr>
-          <w:rFonts w:ascii="Times New Roman" w:cs="Times New Roman" w:eastAsia="Times New Roman" w:hAnsi="Times New Roman"/>
-          <w:sz w:val="24"/>
-          <w:szCs w:val="24"/>
-          <w:rtl w:val="0"/>
-        </w:rPr>
-        <w:t xml:space="preserve">all-MiniLM-L12-v2</w:t>
-      </w:r>
-      <w:r>
-        <w:rPr>
-          <w:rFonts w:ascii="Times New Roman" w:cs="Times New Roman" w:eastAsia="Times New Roman" w:hAnsi="Times New Roman"/>
-          <w:color w:val="2a2a2a"/>
-          <w:sz w:val="24"/>
-          <w:szCs w:val="24"/>
-          <w:rtl w:val="0"/>
-        </w:rPr>
-        <w:t xml:space="preserve">+Euclidean Dist when standardizing against WHO-5th. Methods based on the models </w:t>
-      </w:r>
-      <w:r>
-        <w:rPr>
-          <w:rFonts w:ascii="Times New Roman" w:cs="Times New Roman" w:eastAsia="Times New Roman" w:hAnsi="Times New Roman"/>
-          <w:sz w:val="24"/>
-          <w:szCs w:val="24"/>
-          <w:rtl w:val="0"/>
-        </w:rPr>
-        <w:t xml:space="preserve">all-roberta-large-v1</w:t>
-      </w:r>
-      <w:r>
-        <w:rPr>
-          <w:rFonts w:ascii="Times New Roman" w:cs="Times New Roman" w:eastAsia="Times New Roman" w:hAnsi="Times New Roman"/>
-          <w:color w:val="2a2a2a"/>
-          <w:sz w:val="24"/>
-          <w:szCs w:val="24"/>
-          <w:rtl w:val="0"/>
-        </w:rPr>
-        <w:t xml:space="preserve">, </w:t>
-      </w:r>
-      <w:r>
-        <w:rPr>
-          <w:rFonts w:ascii="Times New Roman" w:cs="Times New Roman" w:eastAsia="Times New Roman" w:hAnsi="Times New Roman"/>
-          <w:sz w:val="24"/>
-          <w:szCs w:val="24"/>
-          <w:rtl w:val="0"/>
-        </w:rPr>
-        <w:t xml:space="preserve">gtr-t5-large</w:t>
-      </w:r>
-      <w:r>
-        <w:rPr>
-          <w:rFonts w:ascii="Times New Roman" w:cs="Times New Roman" w:eastAsia="Times New Roman" w:hAnsi="Times New Roman"/>
-          <w:color w:val="2a2a2a"/>
-          <w:sz w:val="24"/>
-          <w:szCs w:val="24"/>
-          <w:rtl w:val="0"/>
-        </w:rPr>
-        <w:t xml:space="preserve">, </w:t>
-      </w:r>
-      <w:r>
-        <w:rPr>
-          <w:rFonts w:ascii="Times New Roman" w:cs="Times New Roman" w:eastAsia="Times New Roman" w:hAnsi="Times New Roman"/>
-          <w:sz w:val="24"/>
-          <w:szCs w:val="24"/>
-          <w:rtl w:val="0"/>
-        </w:rPr>
-        <w:t xml:space="preserve">embed-english-v2.0</w:t>
-      </w:r>
-      <w:r>
-        <w:rPr>
-          <w:rFonts w:ascii="Times New Roman" w:cs="Times New Roman" w:eastAsia="Times New Roman" w:hAnsi="Times New Roman"/>
-          <w:color w:val="2a2a2a"/>
-          <w:sz w:val="24"/>
-          <w:szCs w:val="24"/>
-          <w:rtl w:val="0"/>
-        </w:rPr>
-        <w:t xml:space="preserve">, and </w:t>
-      </w:r>
-      <w:r>
-        <w:rPr>
-          <w:rFonts w:ascii="Times New Roman" w:cs="Times New Roman" w:eastAsia="Times New Roman" w:hAnsi="Times New Roman"/>
-          <w:sz w:val="24"/>
-          <w:szCs w:val="24"/>
-          <w:rtl w:val="0"/>
-        </w:rPr>
-        <w:t xml:space="preserve">e5-large-v2</w:t>
-      </w:r>
-      <w:r>
-        <w:rPr>
-          <w:rFonts w:ascii="Times New Roman" w:cs="Times New Roman" w:eastAsia="Times New Roman" w:hAnsi="Times New Roman"/>
-          <w:color w:val="2a2a2a"/>
-          <w:sz w:val="24"/>
-          <w:szCs w:val="24"/>
-          <w:rtl w:val="0"/>
-        </w:rPr>
-        <w:t xml:space="preserve"> are classified as intermediate-accuracy methods for both WHO-5th and WHO-all. SapBERT was classified as both an intermediate and low-accuracy method as its standardization accuracy was 51.7% against WHO-5th and 47.9% against WHO-all. The low-accuracy text-embedding methods were based on models such as </w:t>
-      </w:r>
-      <w:r>
-        <w:rPr>
-          <w:rFonts w:ascii="Times New Roman" w:cs="Times New Roman" w:eastAsia="Times New Roman" w:hAnsi="Times New Roman"/>
-          <w:sz w:val="24"/>
-          <w:szCs w:val="24"/>
-          <w:rtl w:val="0"/>
-        </w:rPr>
-        <w:t xml:space="preserve">Llama3.3_70B, Llama3.2_3B, Llama3.0, MedLlama2, MedLlama_13B, BioBERT, SciBERT, PubMedBERT, ModernBERT, Phi-4 and  DeepSeek_8B. </w:t>
-      </w:r>
-      <w:r>
-        <w:rPr>
-          <w:rFonts w:ascii="Times New Roman" w:cs="Times New Roman" w:eastAsia="Times New Roman" w:hAnsi="Times New Roman"/>
-          <w:color w:val="2a2a2a"/>
-          <w:sz w:val="24"/>
-          <w:szCs w:val="24"/>
-          <w:rtl w:val="0"/>
-        </w:rPr>
-        <w:t xml:space="preserve">The standardization accuracies of the low-accuracy models were either comparable or poorer compared to the text-matching methods. </w:t>
+          <w:rtl w:val="0"/>
+        </w:rPr>
       </w:r>
     </w:p>
     <w:p>
@@ -6209,8 +6032,203 @@
       </w:pPr>
       <w:r>
         <w:rPr>
-          <w:rtl w:val="0"/>
-        </w:rPr>
+          <w:rFonts w:ascii="Times New Roman" w:cs="Times New Roman" w:eastAsia="Times New Roman" w:hAnsi="Times New Roman"/>
+          <w:color w:val="2a2a2a"/>
+          <w:sz w:val="24"/>
+          <w:szCs w:val="24"/>
+          <w:rtl w:val="0"/>
+        </w:rPr>
+        <w:t xml:space="preserve">When standardizing against either WHO-5th or WHO-all, methods based on text-embeddings generated from the models LTE-3, ADA-002, </w:t>
+      </w:r>
+      <w:r>
+        <w:rPr>
+          <w:rFonts w:ascii="Times New Roman" w:cs="Times New Roman" w:eastAsia="Times New Roman" w:hAnsi="Times New Roman"/>
+          <w:sz w:val="24"/>
+          <w:szCs w:val="24"/>
+          <w:rtl w:val="0"/>
+        </w:rPr>
+        <w:t xml:space="preserve">all-MiniLM-L12-v2</w:t>
+      </w:r>
+      <w:r>
+        <w:rPr>
+          <w:rFonts w:ascii="Times New Roman" w:cs="Times New Roman" w:eastAsia="Times New Roman" w:hAnsi="Times New Roman"/>
+          <w:color w:val="2a2a2a"/>
+          <w:sz w:val="24"/>
+          <w:szCs w:val="24"/>
+          <w:rtl w:val="0"/>
+        </w:rPr>
+        <w:t xml:space="preserve">, </w:t>
+      </w:r>
+      <w:r>
+        <w:rPr>
+          <w:rFonts w:ascii="Times New Roman" w:cs="Times New Roman" w:eastAsia="Times New Roman" w:hAnsi="Times New Roman"/>
+          <w:sz w:val="24"/>
+          <w:szCs w:val="24"/>
+          <w:rtl w:val="0"/>
+        </w:rPr>
+        <w:t xml:space="preserve">all-MiniLM-L6-v2</w:t>
+      </w:r>
+      <w:r>
+        <w:rPr>
+          <w:rFonts w:ascii="Times New Roman" w:cs="Times New Roman" w:eastAsia="Times New Roman" w:hAnsi="Times New Roman"/>
+          <w:color w:val="2a2a2a"/>
+          <w:sz w:val="24"/>
+          <w:szCs w:val="24"/>
+          <w:rtl w:val="0"/>
+        </w:rPr>
+        <w:t xml:space="preserve">, </w:t>
+      </w:r>
+      <w:r>
+        <w:rPr>
+          <w:rFonts w:ascii="Times New Roman" w:cs="Times New Roman" w:eastAsia="Times New Roman" w:hAnsi="Times New Roman"/>
+          <w:sz w:val="24"/>
+          <w:szCs w:val="24"/>
+          <w:rtl w:val="0"/>
+        </w:rPr>
+        <w:t xml:space="preserve">e5-large</w:t>
+      </w:r>
+      <w:r>
+        <w:rPr>
+          <w:rFonts w:ascii="Times New Roman" w:cs="Times New Roman" w:eastAsia="Times New Roman" w:hAnsi="Times New Roman"/>
+          <w:color w:val="2a2a2a"/>
+          <w:sz w:val="24"/>
+          <w:szCs w:val="24"/>
+          <w:rtl w:val="0"/>
+        </w:rPr>
+        <w:t xml:space="preserve">, </w:t>
+      </w:r>
+      <w:r>
+        <w:rPr>
+          <w:rFonts w:ascii="Times New Roman" w:cs="Times New Roman" w:eastAsia="Times New Roman" w:hAnsi="Times New Roman"/>
+          <w:sz w:val="24"/>
+          <w:szCs w:val="24"/>
+          <w:rtl w:val="0"/>
+        </w:rPr>
+        <w:t xml:space="preserve">all-mpnet-base-v2</w:t>
+      </w:r>
+      <w:r>
+        <w:rPr>
+          <w:rFonts w:ascii="Times New Roman" w:cs="Times New Roman" w:eastAsia="Times New Roman" w:hAnsi="Times New Roman"/>
+          <w:color w:val="2a2a2a"/>
+          <w:sz w:val="24"/>
+          <w:szCs w:val="24"/>
+          <w:rtl w:val="0"/>
+        </w:rPr>
+        <w:t xml:space="preserve">, and nomic achieved a minimum standardization accuracy of at least 60.2% and were consequently classified as high-accuracy methods. The highest standardization accuracy is obtained by the methods LTE-3+Euclidean Dist when standardizing against WHO-all and by </w:t>
+      </w:r>
+      <w:r>
+        <w:rPr>
+          <w:rFonts w:ascii="Times New Roman" w:cs="Times New Roman" w:eastAsia="Times New Roman" w:hAnsi="Times New Roman"/>
+          <w:sz w:val="24"/>
+          <w:szCs w:val="24"/>
+          <w:rtl w:val="0"/>
+        </w:rPr>
+        <w:t xml:space="preserve">all-MiniLM-L12-v2</w:t>
+      </w:r>
+      <w:r>
+        <w:rPr>
+          <w:rFonts w:ascii="Times New Roman" w:cs="Times New Roman" w:eastAsia="Times New Roman" w:hAnsi="Times New Roman"/>
+          <w:color w:val="2a2a2a"/>
+          <w:sz w:val="24"/>
+          <w:szCs w:val="24"/>
+          <w:rtl w:val="0"/>
+        </w:rPr>
+        <w:t xml:space="preserve">+Euclidean Dist when standardizing against WHO-5th. Methods based on the models </w:t>
+      </w:r>
+      <w:r>
+        <w:rPr>
+          <w:rFonts w:ascii="Times New Roman" w:cs="Times New Roman" w:eastAsia="Times New Roman" w:hAnsi="Times New Roman"/>
+          <w:sz w:val="24"/>
+          <w:szCs w:val="24"/>
+          <w:rtl w:val="0"/>
+        </w:rPr>
+        <w:t xml:space="preserve">all-roberta-large-v1</w:t>
+      </w:r>
+      <w:r>
+        <w:rPr>
+          <w:rFonts w:ascii="Times New Roman" w:cs="Times New Roman" w:eastAsia="Times New Roman" w:hAnsi="Times New Roman"/>
+          <w:color w:val="2a2a2a"/>
+          <w:sz w:val="24"/>
+          <w:szCs w:val="24"/>
+          <w:rtl w:val="0"/>
+        </w:rPr>
+        <w:t xml:space="preserve">, </w:t>
+      </w:r>
+      <w:r>
+        <w:rPr>
+          <w:rFonts w:ascii="Times New Roman" w:cs="Times New Roman" w:eastAsia="Times New Roman" w:hAnsi="Times New Roman"/>
+          <w:sz w:val="24"/>
+          <w:szCs w:val="24"/>
+          <w:rtl w:val="0"/>
+        </w:rPr>
+        <w:t xml:space="preserve">gtr-t5-large</w:t>
+      </w:r>
+      <w:r>
+        <w:rPr>
+          <w:rFonts w:ascii="Times New Roman" w:cs="Times New Roman" w:eastAsia="Times New Roman" w:hAnsi="Times New Roman"/>
+          <w:color w:val="2a2a2a"/>
+          <w:sz w:val="24"/>
+          <w:szCs w:val="24"/>
+          <w:rtl w:val="0"/>
+        </w:rPr>
+        <w:t xml:space="preserve">, </w:t>
+      </w:r>
+      <w:r>
+        <w:rPr>
+          <w:rFonts w:ascii="Times New Roman" w:cs="Times New Roman" w:eastAsia="Times New Roman" w:hAnsi="Times New Roman"/>
+          <w:sz w:val="24"/>
+          <w:szCs w:val="24"/>
+          <w:rtl w:val="0"/>
+        </w:rPr>
+        <w:t xml:space="preserve">embed-english-v2.0</w:t>
+      </w:r>
+      <w:r>
+        <w:rPr>
+          <w:rFonts w:ascii="Times New Roman" w:cs="Times New Roman" w:eastAsia="Times New Roman" w:hAnsi="Times New Roman"/>
+          <w:color w:val="2a2a2a"/>
+          <w:sz w:val="24"/>
+          <w:szCs w:val="24"/>
+          <w:rtl w:val="0"/>
+        </w:rPr>
+        <w:t xml:space="preserve">, and </w:t>
+      </w:r>
+      <w:r>
+        <w:rPr>
+          <w:rFonts w:ascii="Times New Roman" w:cs="Times New Roman" w:eastAsia="Times New Roman" w:hAnsi="Times New Roman"/>
+          <w:sz w:val="24"/>
+          <w:szCs w:val="24"/>
+          <w:rtl w:val="0"/>
+        </w:rPr>
+        <w:t xml:space="preserve">e5-large-v2</w:t>
+      </w:r>
+      <w:r>
+        <w:rPr>
+          <w:rFonts w:ascii="Times New Roman" w:cs="Times New Roman" w:eastAsia="Times New Roman" w:hAnsi="Times New Roman"/>
+          <w:color w:val="2a2a2a"/>
+          <w:sz w:val="24"/>
+          <w:szCs w:val="24"/>
+          <w:rtl w:val="0"/>
+        </w:rPr>
+        <w:t xml:space="preserve"> are classified as intermediate-accuracy methods for both WHO-5th and WHO-all. SapBERT was classified as both an intermediate and low-accuracy method as its standardization accuracy was 51.7% against WHO-5th and 47.9% against WHO-all. The low-accuracy text-embedding methods were based on models such as </w:t>
+      </w:r>
+      <w:r>
+        <w:rPr>
+          <w:rFonts w:ascii="Times New Roman" w:cs="Times New Roman" w:eastAsia="Times New Roman" w:hAnsi="Times New Roman"/>
+          <w:sz w:val="24"/>
+          <w:szCs w:val="24"/>
+          <w:rtl w:val="0"/>
+        </w:rPr>
+        <w:t xml:space="preserve">Llama3.3_70B, Llama3.2_3B, Llama3.0, MedLlama2, MedLlama_13B, BioBERT, SciBERT, PubMedBERT, ModernBERT, Phi-4 and  DeepSeek_8B. </w:t>
+      </w:r>
+      <w:r>
+        <w:rPr>
+          <w:rFonts w:ascii="Times New Roman" w:cs="Times New Roman" w:eastAsia="Times New Roman" w:hAnsi="Times New Roman"/>
+          <w:color w:val="2a2a2a"/>
+          <w:sz w:val="24"/>
+          <w:szCs w:val="24"/>
+          <w:rtl w:val="0"/>
+        </w:rPr>
+        <w:t xml:space="preserve">The standardization accuracies of the low-accuracy models were either comparable or poorer compared to the text-matching methods. </w:t>
       </w:r>
     </w:p>
     <w:p>
@@ -6227,34 +6245,8 @@
       </w:pPr>
       <w:r>
         <w:rPr>
-          <w:rFonts w:ascii="Times New Roman" w:cs="Times New Roman" w:eastAsia="Times New Roman" w:hAnsi="Times New Roman"/>
-          <w:color w:val="2a2a2a"/>
-          <w:sz w:val="24"/>
-          <w:szCs w:val="24"/>
-          <w:rtl w:val="0"/>
-        </w:rPr>
-        <w:t xml:space="preserve">CANTOS standardizes CTR tumor names using either closest match or clustering, applied to both text-matching and text-embedding methods. For text-embedding methods, we observed that clustering based approaches did not improve accuracy over their closest match counterparts methods. This was also the case for most text-matching methods, except for the method cosine+AP  which had a marginally higher accuracy compared to cosine distance when standardized against WHO-5th (</w:t>
-      </w:r>
-      <w:r>
-        <w:rPr>
-          <w:rFonts w:ascii="Times New Roman" w:cs="Times New Roman" w:eastAsia="Times New Roman" w:hAnsi="Times New Roman"/>
-          <w:b w:val="1"/>
-          <w:color w:val="2a2a2a"/>
-          <w:sz w:val="24"/>
-          <w:szCs w:val="24"/>
-          <w:rtl w:val="0"/>
-        </w:rPr>
-        <w:t xml:space="preserve">Table 2</w:t>
-      </w:r>
-      <w:r>
-        <w:rPr>
-          <w:rFonts w:ascii="Times New Roman" w:cs="Times New Roman" w:eastAsia="Times New Roman" w:hAnsi="Times New Roman"/>
-          <w:color w:val="2a2a2a"/>
-          <w:sz w:val="24"/>
-          <w:szCs w:val="24"/>
-          <w:rtl w:val="0"/>
-        </w:rPr>
-        <w:t xml:space="preserve">). Closest match methods are also simpler and faster, avoiding additional clustering steps such as cluster size analysis, or outlier detection.</w:t>
+          <w:rtl w:val="0"/>
+        </w:rPr>
       </w:r>
     </w:p>
     <w:p>
@@ -6271,8 +6263,34 @@
       </w:pPr>
       <w:r>
         <w:rPr>
-          <w:rtl w:val="0"/>
-        </w:rPr>
+          <w:rFonts w:ascii="Times New Roman" w:cs="Times New Roman" w:eastAsia="Times New Roman" w:hAnsi="Times New Roman"/>
+          <w:color w:val="2a2a2a"/>
+          <w:sz w:val="24"/>
+          <w:szCs w:val="24"/>
+          <w:rtl w:val="0"/>
+        </w:rPr>
+        <w:t xml:space="preserve">CANTOS standardizes CTR tumor names using either closest match or clustering approaches, applied to both text-matching and text-embedding methods. For text-embedding methods, we observed that clustering based approaches did not improve accuracy over their closest match counterparts. This was also the case for most text-matching methods, except for the method cosine+AP  which had a marginally higher accuracy compared to cosine distance when standardized against WHO-5th (</w:t>
+      </w:r>
+      <w:r>
+        <w:rPr>
+          <w:rFonts w:ascii="Times New Roman" w:cs="Times New Roman" w:eastAsia="Times New Roman" w:hAnsi="Times New Roman"/>
+          <w:b w:val="1"/>
+          <w:color w:val="2a2a2a"/>
+          <w:sz w:val="24"/>
+          <w:szCs w:val="24"/>
+          <w:rtl w:val="0"/>
+        </w:rPr>
+        <w:t xml:space="preserve">Table 2</w:t>
+      </w:r>
+      <w:r>
+        <w:rPr>
+          <w:rFonts w:ascii="Times New Roman" w:cs="Times New Roman" w:eastAsia="Times New Roman" w:hAnsi="Times New Roman"/>
+          <w:color w:val="2a2a2a"/>
+          <w:sz w:val="24"/>
+          <w:szCs w:val="24"/>
+          <w:rtl w:val="0"/>
+        </w:rPr>
+        <w:t xml:space="preserve">). Closest match methods are also simpler and faster, avoiding additional clustering steps such as cluster size analysis, or outlier detection.</w:t>
       </w:r>
     </w:p>
     <w:p>
@@ -6282,78 +6300,11 @@
         <w:jc w:val="both"/>
         <w:rPr>
           <w:rFonts w:ascii="Times New Roman" w:cs="Times New Roman" w:eastAsia="Times New Roman" w:hAnsi="Times New Roman"/>
-          <w:sz w:val="28"/>
-          <w:szCs w:val="28"/>
-          <w:highlight w:val="white"/>
+          <w:color w:val="2a2a2a"/>
+          <w:sz w:val="24"/>
+          <w:szCs w:val="24"/>
         </w:rPr>
       </w:pPr>
-      <w:r>
-        <w:rPr>
-          <w:rFonts w:ascii="Times New Roman" w:cs="Times New Roman" w:eastAsia="Times New Roman" w:hAnsi="Times New Roman"/>
-          <w:color w:val="2a2a2a"/>
-          <w:sz w:val="24"/>
-          <w:szCs w:val="24"/>
-          <w:rtl w:val="0"/>
-        </w:rPr>
-        <w:t xml:space="preserve">To improve standardization accuracy, we implemented a majority vote approach by selecting three methods classified as high-accuracy methods. We selected the methods based on lowest AMI  to maximize prediction diversity. Since only 11 methods were classified as high accuracy for both WHO-5th and WHO-all there were a total of 165 </w:t>
-      </w:r>
-      <w:r>
-        <w:rPr>
-          <w:rFonts w:ascii="Times New Roman" w:cs="Times New Roman" w:eastAsia="Times New Roman" w:hAnsi="Times New Roman"/>
-          <w:sz w:val="24"/>
-          <w:szCs w:val="24"/>
-          <w:rtl w:val="0"/>
-        </w:rPr>
-        <w:t xml:space="preserve"> (</w:t>
-      </w:r>
-      <w:r>
-        <w:rPr>
-          <w:rFonts w:ascii="Times New Roman" w:cs="Times New Roman" w:eastAsia="Times New Roman" w:hAnsi="Times New Roman"/>
-          <w:sz w:val="24"/>
-          <w:szCs w:val="24"/>
-          <w:vertAlign w:val="superscript"/>
-          <w:rtl w:val="0"/>
-        </w:rPr>
-        <w:t xml:space="preserve">11</w:t>
-      </w:r>
-      <w:r>
-        <w:rPr>
-          <w:rFonts w:ascii="Times New Roman" w:cs="Times New Roman" w:eastAsia="Times New Roman" w:hAnsi="Times New Roman"/>
-          <w:sz w:val="24"/>
-          <w:szCs w:val="24"/>
-          <w:rtl w:val="0"/>
-        </w:rPr>
-        <w:t xml:space="preserve">C</w:t>
-      </w:r>
-      <w:r>
-        <w:rPr>
-          <w:rFonts w:ascii="Times New Roman" w:cs="Times New Roman" w:eastAsia="Times New Roman" w:hAnsi="Times New Roman"/>
-          <w:sz w:val="24"/>
-          <w:szCs w:val="24"/>
-          <w:vertAlign w:val="subscript"/>
-          <w:rtl w:val="0"/>
-        </w:rPr>
-        <w:t xml:space="preserve">3</w:t>
-      </w:r>
-      <w:r>
-        <w:rPr>
-          <w:rFonts w:ascii="Times New Roman" w:cs="Times New Roman" w:eastAsia="Times New Roman" w:hAnsi="Times New Roman"/>
-          <w:sz w:val="24"/>
-          <w:szCs w:val="24"/>
-          <w:rtl w:val="0"/>
-        </w:rPr>
-        <w:t xml:space="preserve">) three-method combinations. The combination of methods that had the lowest AMI  for WHO-5th included </w:t>
-      </w:r>
-      <w:r>
-        <w:rPr>
-          <w:rFonts w:ascii="Times New Roman" w:cs="Times New Roman" w:eastAsia="Times New Roman" w:hAnsi="Times New Roman"/>
-          <w:color w:val="2a2a2a"/>
-          <w:sz w:val="24"/>
-          <w:szCs w:val="24"/>
-          <w:rtl w:val="0"/>
-        </w:rPr>
-        <w:t xml:space="preserve">ADA-002+AP, LTE-3+K-means, and all-MiniLM-L12-v2+Euclidean Dist which achieved 72.1% accuracy. Whereas for WHO-all it was the combination of ADA-002+K-means, LTE-3+K-means, and all-MiniLM-L12-v2+Euclidean Dist which achieved 71.4%. These majority vote based methods outperformed the top individual methods by ~4% (WHO-5th, +41 terms) and ~2% (WHO-all, +22 terms) on the subset of 1,600 CTR tumor names with a ground truth in the WHO system. While the standardization accuracy of the selected combination of methods for majority vote improved for both the WHO-5th and WHO-all for this subset of CTR tumor names, this improvement may not generalize to a different subset of tumor names from the CTR. When all eleven methods for majority voting reduced accuracy to 44.2% (WHO-5th) and 48.4% (WHO-all), demonstrating the benefit of mutual information-based selection for boosting accuracy. While effective on the evaluated subset, generalizability to other tumor sets requires further validation.</w:t>
-      </w:r>
       <w:r>
         <w:rPr>
           <w:rtl w:val="0"/>
@@ -6370,13 +6321,74 @@
           <w:color w:val="2a2a2a"/>
           <w:sz w:val="24"/>
           <w:szCs w:val="24"/>
-          <w:highlight w:val="yellow"/>
         </w:rPr>
       </w:pPr>
       <w:r>
         <w:rPr>
-          <w:rtl w:val="0"/>
-        </w:rPr>
+          <w:rFonts w:ascii="Times New Roman" w:cs="Times New Roman" w:eastAsia="Times New Roman" w:hAnsi="Times New Roman"/>
+          <w:color w:val="2a2a2a"/>
+          <w:sz w:val="24"/>
+          <w:szCs w:val="24"/>
+          <w:rtl w:val="0"/>
+        </w:rPr>
+        <w:t xml:space="preserve">To improve standardization accuracy, we implemented a majority vote approach by selecting three methods classified as high-accuracy methods. We selected the methods based on lowest AMI  to maximize prediction diversity. Since only 11 methods were classified as high accuracy for both WHO-5th and WHO-all, there were a total of 165 </w:t>
+      </w:r>
+      <w:r>
+        <w:rPr>
+          <w:rFonts w:ascii="Times New Roman" w:cs="Times New Roman" w:eastAsia="Times New Roman" w:hAnsi="Times New Roman"/>
+          <w:sz w:val="24"/>
+          <w:szCs w:val="24"/>
+          <w:rtl w:val="0"/>
+        </w:rPr>
+        <w:t xml:space="preserve"> (</w:t>
+      </w:r>
+      <w:r>
+        <w:rPr>
+          <w:rFonts w:ascii="Times New Roman" w:cs="Times New Roman" w:eastAsia="Times New Roman" w:hAnsi="Times New Roman"/>
+          <w:sz w:val="24"/>
+          <w:szCs w:val="24"/>
+          <w:vertAlign w:val="superscript"/>
+          <w:rtl w:val="0"/>
+        </w:rPr>
+        <w:t xml:space="preserve">11</w:t>
+      </w:r>
+      <w:r>
+        <w:rPr>
+          <w:rFonts w:ascii="Times New Roman" w:cs="Times New Roman" w:eastAsia="Times New Roman" w:hAnsi="Times New Roman"/>
+          <w:sz w:val="24"/>
+          <w:szCs w:val="24"/>
+          <w:rtl w:val="0"/>
+        </w:rPr>
+        <w:t xml:space="preserve">C</w:t>
+      </w:r>
+      <w:r>
+        <w:rPr>
+          <w:rFonts w:ascii="Times New Roman" w:cs="Times New Roman" w:eastAsia="Times New Roman" w:hAnsi="Times New Roman"/>
+          <w:sz w:val="24"/>
+          <w:szCs w:val="24"/>
+          <w:vertAlign w:val="subscript"/>
+          <w:rtl w:val="0"/>
+        </w:rPr>
+        <w:t xml:space="preserve">3</w:t>
+      </w:r>
+      <w:r>
+        <w:rPr>
+          <w:rFonts w:ascii="Times New Roman" w:cs="Times New Roman" w:eastAsia="Times New Roman" w:hAnsi="Times New Roman"/>
+          <w:sz w:val="24"/>
+          <w:szCs w:val="24"/>
+          <w:rtl w:val="0"/>
+        </w:rPr>
+        <w:t xml:space="preserve">) three-method combinations for either WHO editions. The combination of methods that had the lowest AMI  for WHO-5th included </w:t>
+      </w:r>
+      <w:r>
+        <w:rPr>
+          <w:rFonts w:ascii="Times New Roman" w:cs="Times New Roman" w:eastAsia="Times New Roman" w:hAnsi="Times New Roman"/>
+          <w:color w:val="2a2a2a"/>
+          <w:sz w:val="24"/>
+          <w:szCs w:val="24"/>
+          <w:rtl w:val="0"/>
+        </w:rPr>
+        <w:t xml:space="preserve">ADA-002+AP, LTE-3+K-means, and all-MiniLM-L12-v2+Euclidean Dist and achieved 72.1% accuracy. Whereas for WHO-all, it was the combination of ADA-002+K-means, LTE-3+K-means, and all-MiniLM-L12-v2+Euclidean Dist which achieved 71.4% accuracy. These majority vote based methods outperformed the top individual methods by ~4% (WHO-5th, +41 terms) and ~2% (WHO-all, +22 terms) on the subset of 1,600 CTR tumor names with a ground truth in the WHO system. While the standardization accuracy of the selected combination of methods for majority vote improved for both the WHO-5th and WHO-all for this subset of CTR tumor names, this improvement may not generalize on a different subset of tumor names from the CTR. When all eleven methods were used for majority voting, accuracy reduced to 44.2% (WHO-5th) and 48.4% (WHO-all), demonstrating the benefit of mutual information-based selection for boosting accuracy. </w:t>
       </w:r>
     </w:p>
     <w:p>
@@ -6386,199 +6398,15 @@
         <w:jc w:val="both"/>
         <w:rPr>
           <w:rFonts w:ascii="Times New Roman" w:cs="Times New Roman" w:eastAsia="Times New Roman" w:hAnsi="Times New Roman"/>
+          <w:color w:val="2a2a2a"/>
           <w:sz w:val="24"/>
           <w:szCs w:val="24"/>
         </w:rPr>
       </w:pPr>
       <w:r>
         <w:rPr>
-          <w:rFonts w:ascii="Times New Roman" w:cs="Times New Roman" w:eastAsia="Times New Roman" w:hAnsi="Times New Roman"/>
-          <w:sz w:val="24"/>
-          <w:szCs w:val="24"/>
-          <w:highlight w:val="white"/>
-          <w:rtl w:val="0"/>
-        </w:rPr>
-        <w:t xml:space="preserve">The CANTOS pipeline is adaptable for standardizing biomedical nomenclature across various systems beyond the WHO system and NCIt. It can be extended to work with other ontologies such as MONDO</w:t>
-      </w:r>
-      <w:hyperlink r:id="rId75">
-        <w:r>
-          <w:rPr>
-            <w:rFonts w:ascii="Times New Roman" w:cs="Times New Roman" w:eastAsia="Times New Roman" w:hAnsi="Times New Roman"/>
-            <w:b w:val="0"/>
-            <w:color w:val="000000"/>
-            <w:sz w:val="24"/>
-            <w:szCs w:val="24"/>
-            <w:highlight w:val="white"/>
-            <w:u w:val="none"/>
-            <w:rtl w:val="0"/>
-          </w:rPr>
-          <w:t xml:space="preserve">[129]</w:t>
-        </w:r>
-      </w:hyperlink>
-      <w:r>
-        <w:rPr>
-          <w:rFonts w:ascii="Times New Roman" w:cs="Times New Roman" w:eastAsia="Times New Roman" w:hAnsi="Times New Roman"/>
-          <w:sz w:val="24"/>
-          <w:szCs w:val="24"/>
-          <w:highlight w:val="white"/>
-          <w:rtl w:val="0"/>
-        </w:rPr>
-        <w:t xml:space="preserve">, Disease Ontology (DO)</w:t>
-      </w:r>
-      <w:hyperlink r:id="rId76">
-        <w:r>
-          <w:rPr>
-            <w:rFonts w:ascii="Times New Roman" w:cs="Times New Roman" w:eastAsia="Times New Roman" w:hAnsi="Times New Roman"/>
-            <w:b w:val="0"/>
-            <w:color w:val="000000"/>
-            <w:sz w:val="24"/>
-            <w:szCs w:val="24"/>
-            <w:highlight w:val="white"/>
-            <w:u w:val="none"/>
-            <w:rtl w:val="0"/>
-          </w:rPr>
-          <w:t xml:space="preserve">[130–140]</w:t>
-        </w:r>
-      </w:hyperlink>
-      <w:r>
-        <w:rPr>
-          <w:rFonts w:ascii="Times New Roman" w:cs="Times New Roman" w:eastAsia="Times New Roman" w:hAnsi="Times New Roman"/>
-          <w:sz w:val="24"/>
-          <w:szCs w:val="24"/>
-          <w:highlight w:val="white"/>
-          <w:rtl w:val="0"/>
-        </w:rPr>
-        <w:t xml:space="preserve">, Human Phenotype Ontology (HPO)</w:t>
-      </w:r>
-      <w:hyperlink r:id="rId77">
-        <w:r>
-          <w:rPr>
-            <w:rFonts w:ascii="Times New Roman" w:cs="Times New Roman" w:eastAsia="Times New Roman" w:hAnsi="Times New Roman"/>
-            <w:b w:val="0"/>
-            <w:color w:val="000000"/>
-            <w:sz w:val="24"/>
-            <w:szCs w:val="24"/>
-            <w:highlight w:val="white"/>
-            <w:u w:val="none"/>
-            <w:rtl w:val="0"/>
-          </w:rPr>
-          <w:t xml:space="preserve">[141]</w:t>
-        </w:r>
-      </w:hyperlink>
-      <w:r>
-        <w:rPr>
-          <w:rFonts w:ascii="Times New Roman" w:cs="Times New Roman" w:eastAsia="Times New Roman" w:hAnsi="Times New Roman"/>
-          <w:sz w:val="24"/>
-          <w:szCs w:val="24"/>
-          <w:highlight w:val="white"/>
-          <w:rtl w:val="0"/>
-        </w:rPr>
-        <w:t xml:space="preserve">, and medical coding systems like ICD-10</w:t>
-      </w:r>
-      <w:hyperlink r:id="rId78">
-        <w:r>
-          <w:rPr>
-            <w:rFonts w:ascii="Times New Roman" w:cs="Times New Roman" w:eastAsia="Times New Roman" w:hAnsi="Times New Roman"/>
-            <w:b w:val="0"/>
-            <w:color w:val="000000"/>
-            <w:sz w:val="24"/>
-            <w:szCs w:val="24"/>
-            <w:highlight w:val="white"/>
-            <w:u w:val="none"/>
-            <w:rtl w:val="0"/>
-          </w:rPr>
-          <w:t xml:space="preserve">[142]</w:t>
-        </w:r>
-      </w:hyperlink>
-      <w:r>
-        <w:rPr>
-          <w:rFonts w:ascii="Times New Roman" w:cs="Times New Roman" w:eastAsia="Times New Roman" w:hAnsi="Times New Roman"/>
-          <w:sz w:val="24"/>
-          <w:szCs w:val="24"/>
-          <w:highlight w:val="white"/>
-          <w:rtl w:val="0"/>
-        </w:rPr>
-        <w:t xml:space="preserve"> and SNOMED</w:t>
-      </w:r>
-      <w:hyperlink r:id="rId79">
-        <w:r>
-          <w:rPr>
-            <w:rFonts w:ascii="Times New Roman" w:cs="Times New Roman" w:eastAsia="Times New Roman" w:hAnsi="Times New Roman"/>
-            <w:b w:val="0"/>
-            <w:color w:val="000000"/>
-            <w:sz w:val="24"/>
-            <w:szCs w:val="24"/>
-            <w:highlight w:val="white"/>
-            <w:u w:val="none"/>
-            <w:rtl w:val="0"/>
-          </w:rPr>
-          <w:t xml:space="preserve">[143]</w:t>
-        </w:r>
-      </w:hyperlink>
-      <w:r>
-        <w:rPr>
-          <w:rFonts w:ascii="Times New Roman" w:cs="Times New Roman" w:eastAsia="Times New Roman" w:hAnsi="Times New Roman"/>
-          <w:sz w:val="24"/>
-          <w:szCs w:val="24"/>
-          <w:highlight w:val="white"/>
-          <w:rtl w:val="0"/>
-        </w:rPr>
-        <w:t xml:space="preserve">. Future work includes generalizing CANTOS to incorporate additional embedding methods, including domain-specific biomedical LLMs or </w:t>
-      </w:r>
-      <w:r>
-        <w:rPr>
-          <w:rFonts w:ascii="Times New Roman" w:cs="Times New Roman" w:eastAsia="Times New Roman" w:hAnsi="Times New Roman"/>
-          <w:sz w:val="24"/>
-          <w:szCs w:val="24"/>
-          <w:rtl w:val="0"/>
-        </w:rPr>
-        <w:t xml:space="preserve">transformer based models</w:t>
-      </w:r>
-      <w:r>
-        <w:rPr>
-          <w:rFonts w:ascii="Times New Roman" w:cs="Times New Roman" w:eastAsia="Times New Roman" w:hAnsi="Times New Roman"/>
-          <w:sz w:val="24"/>
-          <w:szCs w:val="24"/>
-          <w:rtl w:val="0"/>
-        </w:rPr>
-        <w:t xml:space="preserve">, and expanding its functionality to standardize any collection of biomedical terms.</w:t>
-      </w:r>
-    </w:p>
-    <w:p>
-      <w:pPr>
-        <w:spacing w:line="276.0005454545455" w:lineRule="auto"/>
-        <w:ind w:left="-540" w:firstLine="0"/>
-        <w:rPr>
-          <w:rFonts w:ascii="Times New Roman" w:cs="Times New Roman" w:eastAsia="Times New Roman" w:hAnsi="Times New Roman"/>
-        </w:rPr>
-      </w:pPr>
-      <w:r>
-        <w:rPr>
-          <w:rtl w:val="0"/>
-        </w:rPr>
-      </w:r>
-    </w:p>
-    <w:p>
-      <w:pPr>
-        <w:ind w:left="-540" w:firstLine="0"/>
-        <w:rPr>
-          <w:rFonts w:ascii="Times New Roman" w:cs="Times New Roman" w:eastAsia="Times New Roman" w:hAnsi="Times New Roman"/>
-          <w:b w:val="1"/>
-          <w:sz w:val="28"/>
-          <w:szCs w:val="28"/>
-          <w:highlight w:val="white"/>
-        </w:rPr>
-      </w:pPr>
-      <w:r>
-        <w:rPr>
-          <w:rFonts w:ascii="Times New Roman" w:cs="Times New Roman" w:eastAsia="Times New Roman" w:hAnsi="Times New Roman"/>
-          <w:b w:val="1"/>
-          <w:sz w:val="28"/>
-          <w:szCs w:val="28"/>
-          <w:highlight w:val="white"/>
-          <w:rtl w:val="0"/>
-        </w:rPr>
-        <w:t xml:space="preserve">Limitations of the study</w:t>
+          <w:rtl w:val="0"/>
+        </w:rPr>
       </w:r>
     </w:p>
     <w:p>
@@ -6590,51 +6418,197 @@
           <w:rFonts w:ascii="Times New Roman" w:cs="Times New Roman" w:eastAsia="Times New Roman" w:hAnsi="Times New Roman"/>
           <w:sz w:val="24"/>
           <w:szCs w:val="24"/>
+        </w:rPr>
+      </w:pPr>
+      <w:r>
+        <w:rPr>
+          <w:rFonts w:ascii="Times New Roman" w:cs="Times New Roman" w:eastAsia="Times New Roman" w:hAnsi="Times New Roman"/>
+          <w:sz w:val="24"/>
+          <w:szCs w:val="24"/>
           <w:highlight w:val="white"/>
+          <w:rtl w:val="0"/>
+        </w:rPr>
+        <w:t xml:space="preserve">The CANTOS pipeline is adaptable for standardizing biomedical nomenclature across various systems beyond the WHO system and NCIt. It can be extended to work with other ontologies such as MONDO</w:t>
+      </w:r>
+      <w:hyperlink r:id="rId75">
+        <w:r>
+          <w:rPr>
+            <w:rFonts w:ascii="Times New Roman" w:cs="Times New Roman" w:eastAsia="Times New Roman" w:hAnsi="Times New Roman"/>
+            <w:b w:val="0"/>
+            <w:color w:val="000000"/>
+            <w:sz w:val="24"/>
+            <w:szCs w:val="24"/>
+            <w:highlight w:val="white"/>
+            <w:u w:val="none"/>
+            <w:rtl w:val="0"/>
+          </w:rPr>
+          <w:t xml:space="preserve">[129]</w:t>
+        </w:r>
+      </w:hyperlink>
+      <w:r>
+        <w:rPr>
+          <w:rFonts w:ascii="Times New Roman" w:cs="Times New Roman" w:eastAsia="Times New Roman" w:hAnsi="Times New Roman"/>
+          <w:sz w:val="24"/>
+          <w:szCs w:val="24"/>
+          <w:highlight w:val="white"/>
+          <w:rtl w:val="0"/>
+        </w:rPr>
+        <w:t xml:space="preserve">, Disease Ontology (DO)</w:t>
+      </w:r>
+      <w:hyperlink r:id="rId76">
+        <w:r>
+          <w:rPr>
+            <w:rFonts w:ascii="Times New Roman" w:cs="Times New Roman" w:eastAsia="Times New Roman" w:hAnsi="Times New Roman"/>
+            <w:b w:val="0"/>
+            <w:color w:val="000000"/>
+            <w:sz w:val="24"/>
+            <w:szCs w:val="24"/>
+            <w:highlight w:val="white"/>
+            <w:u w:val="none"/>
+            <w:rtl w:val="0"/>
+          </w:rPr>
+          <w:t xml:space="preserve">[130–140]</w:t>
+        </w:r>
+      </w:hyperlink>
+      <w:r>
+        <w:rPr>
+          <w:rFonts w:ascii="Times New Roman" w:cs="Times New Roman" w:eastAsia="Times New Roman" w:hAnsi="Times New Roman"/>
+          <w:sz w:val="24"/>
+          <w:szCs w:val="24"/>
+          <w:highlight w:val="white"/>
+          <w:rtl w:val="0"/>
+        </w:rPr>
+        <w:t xml:space="preserve">, Human Phenotype Ontology (HPO)</w:t>
+      </w:r>
+      <w:hyperlink r:id="rId77">
+        <w:r>
+          <w:rPr>
+            <w:rFonts w:ascii="Times New Roman" w:cs="Times New Roman" w:eastAsia="Times New Roman" w:hAnsi="Times New Roman"/>
+            <w:b w:val="0"/>
+            <w:color w:val="000000"/>
+            <w:sz w:val="24"/>
+            <w:szCs w:val="24"/>
+            <w:highlight w:val="white"/>
+            <w:u w:val="none"/>
+            <w:rtl w:val="0"/>
+          </w:rPr>
+          <w:t xml:space="preserve">[141]</w:t>
+        </w:r>
+      </w:hyperlink>
+      <w:r>
+        <w:rPr>
+          <w:rFonts w:ascii="Times New Roman" w:cs="Times New Roman" w:eastAsia="Times New Roman" w:hAnsi="Times New Roman"/>
+          <w:sz w:val="24"/>
+          <w:szCs w:val="24"/>
+          <w:highlight w:val="white"/>
+          <w:rtl w:val="0"/>
+        </w:rPr>
+        <w:t xml:space="preserve">, and medical coding systems like ICD-10</w:t>
+      </w:r>
+      <w:hyperlink r:id="rId78">
+        <w:r>
+          <w:rPr>
+            <w:rFonts w:ascii="Times New Roman" w:cs="Times New Roman" w:eastAsia="Times New Roman" w:hAnsi="Times New Roman"/>
+            <w:b w:val="0"/>
+            <w:color w:val="000000"/>
+            <w:sz w:val="24"/>
+            <w:szCs w:val="24"/>
+            <w:highlight w:val="white"/>
+            <w:u w:val="none"/>
+            <w:rtl w:val="0"/>
+          </w:rPr>
+          <w:t xml:space="preserve">[142]</w:t>
+        </w:r>
+      </w:hyperlink>
+      <w:r>
+        <w:rPr>
+          <w:rFonts w:ascii="Times New Roman" w:cs="Times New Roman" w:eastAsia="Times New Roman" w:hAnsi="Times New Roman"/>
+          <w:sz w:val="24"/>
+          <w:szCs w:val="24"/>
+          <w:highlight w:val="white"/>
+          <w:rtl w:val="0"/>
+        </w:rPr>
+        <w:t xml:space="preserve"> and SNOMED</w:t>
+      </w:r>
+      <w:hyperlink r:id="rId79">
+        <w:r>
+          <w:rPr>
+            <w:rFonts w:ascii="Times New Roman" w:cs="Times New Roman" w:eastAsia="Times New Roman" w:hAnsi="Times New Roman"/>
+            <w:b w:val="0"/>
+            <w:color w:val="000000"/>
+            <w:sz w:val="24"/>
+            <w:szCs w:val="24"/>
+            <w:highlight w:val="white"/>
+            <w:u w:val="none"/>
+            <w:rtl w:val="0"/>
+          </w:rPr>
+          <w:t xml:space="preserve">[143]</w:t>
+        </w:r>
+      </w:hyperlink>
+      <w:r>
+        <w:rPr>
+          <w:rFonts w:ascii="Times New Roman" w:cs="Times New Roman" w:eastAsia="Times New Roman" w:hAnsi="Times New Roman"/>
+          <w:sz w:val="24"/>
+          <w:szCs w:val="24"/>
+          <w:highlight w:val="white"/>
+          <w:rtl w:val="0"/>
+        </w:rPr>
+        <w:t xml:space="preserve">. Future work includes generalizing CANTOS to incorporate additional embedding methods, including domain-specific biomedical LLMs or </w:t>
+      </w:r>
+      <w:r>
+        <w:rPr>
+          <w:rFonts w:ascii="Times New Roman" w:cs="Times New Roman" w:eastAsia="Times New Roman" w:hAnsi="Times New Roman"/>
+          <w:sz w:val="24"/>
+          <w:szCs w:val="24"/>
+          <w:rtl w:val="0"/>
+        </w:rPr>
+        <w:t xml:space="preserve">transformer based models</w:t>
+      </w:r>
+      <w:r>
+        <w:rPr>
+          <w:rFonts w:ascii="Times New Roman" w:cs="Times New Roman" w:eastAsia="Times New Roman" w:hAnsi="Times New Roman"/>
+          <w:sz w:val="24"/>
+          <w:szCs w:val="24"/>
+          <w:rtl w:val="0"/>
+        </w:rPr>
+        <w:t xml:space="preserve">, and expanding its functionality to standardize any collection of biomedical terms.</w:t>
+      </w:r>
+    </w:p>
+    <w:p>
+      <w:pPr>
+        <w:spacing w:line="276.0005454545455" w:lineRule="auto"/>
+        <w:ind w:left="-540" w:firstLine="0"/>
+        <w:rPr>
+          <w:rFonts w:ascii="Times New Roman" w:cs="Times New Roman" w:eastAsia="Times New Roman" w:hAnsi="Times New Roman"/>
         </w:rPr>
       </w:pPr>
       <w:r>
         <w:rPr>
-          <w:rFonts w:ascii="Times New Roman" w:cs="Times New Roman" w:eastAsia="Times New Roman" w:hAnsi="Times New Roman"/>
-          <w:sz w:val="24"/>
-          <w:szCs w:val="24"/>
+          <w:rtl w:val="0"/>
+        </w:rPr>
+      </w:r>
+    </w:p>
+    <w:p>
+      <w:pPr>
+        <w:ind w:left="-540" w:firstLine="0"/>
+        <w:rPr>
+          <w:rFonts w:ascii="Times New Roman" w:cs="Times New Roman" w:eastAsia="Times New Roman" w:hAnsi="Times New Roman"/>
+          <w:b w:val="1"/>
+          <w:sz w:val="28"/>
+          <w:szCs w:val="28"/>
           <w:highlight w:val="white"/>
-          <w:rtl w:val="0"/>
-        </w:rPr>
-        <w:t xml:space="preserve">As more CTR tumor names are annotated, accuracy estimates will improve. However, expert annotation is time-intensive, and CANTOS would require rerunning and revalidating as CTR is updated. CANTOS also faces computational challenges, including the cost of generating and storing embeddings. Some biomedical models (e.g., MedLlama, PubMedBERT, SciBERT) underperformed, suggesting that domain-specific models may lack generalization power due to narrow scope or insufficient training data. Embedding quality depends on model architecture, training corpus, and dimensionality. Future improvements may come from LLMs fine-tuned on rich, tumor-specific datasets</w:t>
-      </w:r>
-      <w:r>
-        <w:rPr>
-          <w:rFonts w:ascii="Times New Roman" w:cs="Times New Roman" w:eastAsia="Times New Roman" w:hAnsi="Times New Roman"/>
-          <w:sz w:val="24"/>
-          <w:szCs w:val="24"/>
-          <w:rtl w:val="0"/>
-        </w:rPr>
-        <w:t xml:space="preserve"> </w:t>
-      </w:r>
-      <w:hyperlink r:id="rId80">
-        <w:r>
-          <w:rPr>
-            <w:rFonts w:ascii="Times New Roman" w:cs="Times New Roman" w:eastAsia="Times New Roman" w:hAnsi="Times New Roman"/>
-            <w:b w:val="0"/>
-            <w:color w:val="000000"/>
-            <w:sz w:val="24"/>
-            <w:szCs w:val="24"/>
-            <w:u w:val="none"/>
-            <w:rtl w:val="0"/>
-          </w:rPr>
-          <w:t xml:space="preserve">[144]</w:t>
-        </w:r>
-      </w:hyperlink>
-      <w:r>
-        <w:rPr>
-          <w:rFonts w:ascii="Times New Roman" w:cs="Times New Roman" w:eastAsia="Times New Roman" w:hAnsi="Times New Roman"/>
-          <w:sz w:val="24"/>
-          <w:szCs w:val="24"/>
+        </w:rPr>
+      </w:pPr>
+      <w:r>
+        <w:rPr>
+          <w:rFonts w:ascii="Times New Roman" w:cs="Times New Roman" w:eastAsia="Times New Roman" w:hAnsi="Times New Roman"/>
+          <w:b w:val="1"/>
+          <w:sz w:val="28"/>
+          <w:szCs w:val="28"/>
           <w:highlight w:val="white"/>
           <w:rtl w:val="0"/>
         </w:rPr>
-        <w:t xml:space="preserve"> . LLMs/transformer models may also reflect training biases and are not error-free; CANTOS is intended for research use only and should not inform clinical decisions.</w:t>
+        <w:t xml:space="preserve">Limitations of the study</w:t>
       </w:r>
     </w:p>
     <w:p>
@@ -6651,128 +6625,46 @@
       </w:pPr>
       <w:r>
         <w:rPr>
-          <w:rtl w:val="0"/>
-        </w:rPr>
-      </w:r>
-    </w:p>
-    <w:p>
-      <w:pPr>
-        <w:ind w:left="-540" w:firstLine="0"/>
-        <w:rPr>
-          <w:rFonts w:ascii="Times New Roman" w:cs="Times New Roman" w:eastAsia="Times New Roman" w:hAnsi="Times New Roman"/>
-          <w:b w:val="1"/>
-          <w:sz w:val="28"/>
-          <w:szCs w:val="28"/>
-        </w:rPr>
-      </w:pPr>
-      <w:r>
-        <w:rPr>
-          <w:rFonts w:ascii="Times New Roman" w:cs="Times New Roman" w:eastAsia="Times New Roman" w:hAnsi="Times New Roman"/>
-          <w:b w:val="1"/>
-          <w:sz w:val="28"/>
-          <w:szCs w:val="28"/>
-          <w:rtl w:val="0"/>
-        </w:rPr>
-        <w:t xml:space="preserve">Conclusion</w:t>
-      </w:r>
-    </w:p>
-    <w:p>
-      <w:pPr>
-        <w:ind w:left="-540" w:firstLine="0"/>
-        <w:jc w:val="both"/>
-        <w:rPr>
-          <w:rFonts w:ascii="Times New Roman" w:cs="Times New Roman" w:eastAsia="Times New Roman" w:hAnsi="Times New Roman"/>
-          <w:sz w:val="24"/>
-          <w:szCs w:val="24"/>
-        </w:rPr>
-      </w:pPr>
-      <w:r>
-        <w:rPr>
-          <w:rFonts w:ascii="Times New Roman" w:cs="Times New Roman" w:eastAsia="Times New Roman" w:hAnsi="Times New Roman"/>
-          <w:sz w:val="24"/>
-          <w:szCs w:val="24"/>
-          <w:rtl w:val="0"/>
-        </w:rPr>
-        <w:t xml:space="preserve">Tumor names in the CTR are not explicitly labeled and are often unstandardized, making them difficult to identify and integrate with external biomedical resources. We developed CANTOS, a pipeline that automatically extracts tumor names from the CTR, classifies them as adult or pediatric, and standardizes them with respect to the WHO </w:t>
-      </w:r>
-      <w:r>
-        <w:rPr>
-          <w:rFonts w:ascii="Times New Roman" w:cs="Times New Roman" w:eastAsia="Times New Roman" w:hAnsi="Times New Roman"/>
-          <w:color w:val="2a2a2a"/>
-          <w:sz w:val="24"/>
-          <w:szCs w:val="24"/>
-          <w:rtl w:val="0"/>
-        </w:rPr>
-        <w:t xml:space="preserve">system</w:t>
-      </w:r>
-      <w:r>
-        <w:rPr>
-          <w:rFonts w:ascii="Times New Roman" w:cs="Times New Roman" w:eastAsia="Times New Roman" w:hAnsi="Times New Roman"/>
-          <w:sz w:val="24"/>
-          <w:szCs w:val="24"/>
-          <w:rtl w:val="0"/>
-        </w:rPr>
-        <w:t xml:space="preserve"> and NCIt using 36 methods based on text-matching and text-embedding. Our study showed that several text-embedding methods outperformed text-matching, while others had poorer or comparable performance, highlighting variability in embedding quality. The highest accuracy was achieved by text-embedding based method LTE-3+Euclidean Dist (against WHO-all) and all-MiniLM-L12-v2+Euclidean Dist (against WHO-5th). These findings underscore the need for richer, fine-tuned embeddings trained on diverse biomedical and oncology datasets, including the WHO resource. Such models could improve tumor name identification and standardization, enhancing the performance and scalability of CANTOS.</w:t>
-      </w:r>
-    </w:p>
-    <w:p>
-      <w:pPr>
-        <w:spacing w:line="276.0005454545455" w:lineRule="auto"/>
-        <w:ind w:left="-540" w:firstLine="0"/>
-        <w:rPr>
-          <w:rFonts w:ascii="Times New Roman" w:cs="Times New Roman" w:eastAsia="Times New Roman" w:hAnsi="Times New Roman"/>
-          <w:b w:val="1"/>
+          <w:rFonts w:ascii="Times New Roman" w:cs="Times New Roman" w:eastAsia="Times New Roman" w:hAnsi="Times New Roman"/>
           <w:sz w:val="24"/>
           <w:szCs w:val="24"/>
           <w:highlight w:val="white"/>
-        </w:rPr>
-      </w:pPr>
-      <w:r>
-        <w:rPr>
-          <w:rtl w:val="0"/>
-        </w:rPr>
-      </w:r>
-    </w:p>
-    <w:p>
-      <w:pPr>
-        <w:spacing w:line="276.0005454545455" w:lineRule="auto"/>
-        <w:ind w:left="-540" w:firstLine="0"/>
-        <w:rPr>
-          <w:rFonts w:ascii="Times New Roman" w:cs="Times New Roman" w:eastAsia="Times New Roman" w:hAnsi="Times New Roman"/>
-          <w:b w:val="1"/>
+          <w:rtl w:val="0"/>
+        </w:rPr>
+        <w:t xml:space="preserve">As more CTR tumor names are annotated, accuracy estimates will improve. However, expert annotation is time-intensive, and CANTOS would require rerunning and revalidating as CTR is updated. CANTOS also faces computational challenges, including the cost of generating and storing embeddings. Some biomedical models (e.g., MedLlama, PubMedBERT, SciBERT) underperformed, suggesting that domain-specific models may lack generalization power due to narrow scope or insufficient training data. Embedding quality depends on model architecture, training corpus, and dimensionality. Future improvements may come from LLMs fine-tuned on rich, tumor-specific datasets</w:t>
+      </w:r>
+      <w:r>
+        <w:rPr>
+          <w:rFonts w:ascii="Times New Roman" w:cs="Times New Roman" w:eastAsia="Times New Roman" w:hAnsi="Times New Roman"/>
+          <w:sz w:val="24"/>
+          <w:szCs w:val="24"/>
+          <w:rtl w:val="0"/>
+        </w:rPr>
+        <w:t xml:space="preserve"> </w:t>
+      </w:r>
+      <w:hyperlink r:id="rId80">
+        <w:r>
+          <w:rPr>
+            <w:rFonts w:ascii="Times New Roman" w:cs="Times New Roman" w:eastAsia="Times New Roman" w:hAnsi="Times New Roman"/>
+            <w:b w:val="0"/>
+            <w:color w:val="000000"/>
+            <w:sz w:val="24"/>
+            <w:szCs w:val="24"/>
+            <w:u w:val="none"/>
+            <w:rtl w:val="0"/>
+          </w:rPr>
+          <w:t xml:space="preserve">[144]</w:t>
+        </w:r>
+      </w:hyperlink>
+      <w:r>
+        <w:rPr>
+          <w:rFonts w:ascii="Times New Roman" w:cs="Times New Roman" w:eastAsia="Times New Roman" w:hAnsi="Times New Roman"/>
           <w:sz w:val="24"/>
           <w:szCs w:val="24"/>
           <w:highlight w:val="white"/>
-        </w:rPr>
-      </w:pPr>
-      <w:r>
-        <w:rPr>
-          <w:rtl w:val="0"/>
-        </w:rPr>
-      </w:r>
-    </w:p>
-    <w:p>
-      <w:pPr>
-        <w:spacing w:line="276.0005454545455" w:lineRule="auto"/>
-        <w:ind w:left="-540" w:firstLine="0"/>
-        <w:rPr>
-          <w:rFonts w:ascii="Times New Roman" w:cs="Times New Roman" w:eastAsia="Times New Roman" w:hAnsi="Times New Roman"/>
-          <w:b w:val="1"/>
-          <w:sz w:val="24"/>
-          <w:szCs w:val="24"/>
-          <w:highlight w:val="white"/>
-        </w:rPr>
-      </w:pPr>
-      <w:r>
-        <w:rPr>
-          <w:rFonts w:ascii="Times New Roman" w:cs="Times New Roman" w:eastAsia="Times New Roman" w:hAnsi="Times New Roman"/>
-          <w:b w:val="1"/>
-          <w:sz w:val="24"/>
-          <w:szCs w:val="24"/>
-          <w:highlight w:val="white"/>
-          <w:rtl w:val="0"/>
-        </w:rPr>
-        <w:t xml:space="preserve">Acknowledgements</w:t>
+          <w:rtl w:val="0"/>
+        </w:rPr>
+        <w:t xml:space="preserve"> . LLMs/transformer models may also reflect training biases and are not error-free; CANTOS is intended for research use only and should not inform clinical decisions.</w:t>
       </w:r>
     </w:p>
     <w:p>
@@ -6789,13 +6681,128 @@
       </w:pPr>
       <w:r>
         <w:rPr>
-          <w:rFonts w:ascii="Times New Roman" w:cs="Times New Roman" w:eastAsia="Times New Roman" w:hAnsi="Times New Roman"/>
+          <w:rtl w:val="0"/>
+        </w:rPr>
+      </w:r>
+    </w:p>
+    <w:p>
+      <w:pPr>
+        <w:ind w:left="-540" w:firstLine="0"/>
+        <w:rPr>
+          <w:rFonts w:ascii="Times New Roman" w:cs="Times New Roman" w:eastAsia="Times New Roman" w:hAnsi="Times New Roman"/>
+          <w:b w:val="1"/>
+          <w:sz w:val="28"/>
+          <w:szCs w:val="28"/>
+        </w:rPr>
+      </w:pPr>
+      <w:r>
+        <w:rPr>
+          <w:rFonts w:ascii="Times New Roman" w:cs="Times New Roman" w:eastAsia="Times New Roman" w:hAnsi="Times New Roman"/>
+          <w:b w:val="1"/>
+          <w:sz w:val="28"/>
+          <w:szCs w:val="28"/>
+          <w:rtl w:val="0"/>
+        </w:rPr>
+        <w:t xml:space="preserve">Conclusion</w:t>
+      </w:r>
+    </w:p>
+    <w:p>
+      <w:pPr>
+        <w:ind w:left="-540" w:firstLine="0"/>
+        <w:jc w:val="both"/>
+        <w:rPr>
+          <w:rFonts w:ascii="Times New Roman" w:cs="Times New Roman" w:eastAsia="Times New Roman" w:hAnsi="Times New Roman"/>
+          <w:sz w:val="24"/>
+          <w:szCs w:val="24"/>
+        </w:rPr>
+      </w:pPr>
+      <w:r>
+        <w:rPr>
+          <w:rFonts w:ascii="Times New Roman" w:cs="Times New Roman" w:eastAsia="Times New Roman" w:hAnsi="Times New Roman"/>
+          <w:sz w:val="24"/>
+          <w:szCs w:val="24"/>
+          <w:rtl w:val="0"/>
+        </w:rPr>
+        <w:t xml:space="preserve">Tumor names in the CTR are not explicitly labeled and are often unstandardized, making them difficult to identify and integrate with external biomedical resources. We developed CANTOS, a pipeline that automatically extracts tumor names from the CTR, classifies them as adult or pediatric, and standardizes them with respect to the WHO </w:t>
+      </w:r>
+      <w:r>
+        <w:rPr>
+          <w:rFonts w:ascii="Times New Roman" w:cs="Times New Roman" w:eastAsia="Times New Roman" w:hAnsi="Times New Roman"/>
+          <w:color w:val="2a2a2a"/>
+          <w:sz w:val="24"/>
+          <w:szCs w:val="24"/>
+          <w:rtl w:val="0"/>
+        </w:rPr>
+        <w:t xml:space="preserve">system</w:t>
+      </w:r>
+      <w:r>
+        <w:rPr>
+          <w:rFonts w:ascii="Times New Roman" w:cs="Times New Roman" w:eastAsia="Times New Roman" w:hAnsi="Times New Roman"/>
+          <w:sz w:val="24"/>
+          <w:szCs w:val="24"/>
+          <w:rtl w:val="0"/>
+        </w:rPr>
+        <w:t xml:space="preserve"> and NCIt using 36 methods based on text-matching and text-embedding. Our study showed that several text-embedding methods outperformed text-matching, while others had poorer or comparable performance, highlighting variability in embedding quality. The highest accuracy was achieved by text-embedding based method LTE-3+Euclidean Dist (against WHO-all) and all-MiniLM-L12-v2+Euclidean Dist (against WHO-5th). These findings underscore the need for richer, fine-tuned embeddings trained on diverse biomedical and oncology datasets, including the WHO resource. Such models could improve tumor name identification and standardization, enhancing the performance and scalability of CANTOS.</w:t>
+      </w:r>
+    </w:p>
+    <w:p>
+      <w:pPr>
+        <w:spacing w:line="276.0005454545455" w:lineRule="auto"/>
+        <w:ind w:left="-540" w:firstLine="0"/>
+        <w:rPr>
+          <w:rFonts w:ascii="Times New Roman" w:cs="Times New Roman" w:eastAsia="Times New Roman" w:hAnsi="Times New Roman"/>
+          <w:b w:val="1"/>
           <w:sz w:val="24"/>
           <w:szCs w:val="24"/>
           <w:highlight w:val="white"/>
-          <w:rtl w:val="0"/>
-        </w:rPr>
-        <w:t xml:space="preserve">We thank Dr. Susan Furth and CHOP’s Department of Biomedical and Health Informatics for their ongoing support, and Dr. Sarah Tasian for her guidance on cancer nomenclature review.</w:t>
+        </w:rPr>
+      </w:pPr>
+      <w:r>
+        <w:rPr>
+          <w:rtl w:val="0"/>
+        </w:rPr>
+      </w:r>
+    </w:p>
+    <w:p>
+      <w:pPr>
+        <w:spacing w:line="276.0005454545455" w:lineRule="auto"/>
+        <w:ind w:left="-540" w:firstLine="0"/>
+        <w:rPr>
+          <w:rFonts w:ascii="Times New Roman" w:cs="Times New Roman" w:eastAsia="Times New Roman" w:hAnsi="Times New Roman"/>
+          <w:b w:val="1"/>
+          <w:sz w:val="24"/>
+          <w:szCs w:val="24"/>
+          <w:highlight w:val="white"/>
+        </w:rPr>
+      </w:pPr>
+      <w:r>
+        <w:rPr>
+          <w:rtl w:val="0"/>
+        </w:rPr>
+      </w:r>
+    </w:p>
+    <w:p>
+      <w:pPr>
+        <w:spacing w:line="276.0005454545455" w:lineRule="auto"/>
+        <w:ind w:left="-540" w:firstLine="0"/>
+        <w:rPr>
+          <w:rFonts w:ascii="Times New Roman" w:cs="Times New Roman" w:eastAsia="Times New Roman" w:hAnsi="Times New Roman"/>
+          <w:b w:val="1"/>
+          <w:sz w:val="24"/>
+          <w:szCs w:val="24"/>
+          <w:highlight w:val="white"/>
+        </w:rPr>
+      </w:pPr>
+      <w:r>
+        <w:rPr>
+          <w:rFonts w:ascii="Times New Roman" w:cs="Times New Roman" w:eastAsia="Times New Roman" w:hAnsi="Times New Roman"/>
+          <w:b w:val="1"/>
+          <w:sz w:val="24"/>
+          <w:szCs w:val="24"/>
+          <w:highlight w:val="white"/>
+          <w:rtl w:val="0"/>
+        </w:rPr>
+        <w:t xml:space="preserve">Acknowledgements</w:t>
       </w:r>
     </w:p>
     <w:p>
@@ -6805,7 +6812,6 @@
         <w:jc w:val="both"/>
         <w:rPr>
           <w:rFonts w:ascii="Times New Roman" w:cs="Times New Roman" w:eastAsia="Times New Roman" w:hAnsi="Times New Roman"/>
-          <w:b w:val="1"/>
           <w:sz w:val="24"/>
           <w:szCs w:val="24"/>
           <w:highlight w:val="white"/>
@@ -6813,8 +6819,13 @@
       </w:pPr>
       <w:r>
         <w:rPr>
-          <w:rtl w:val="0"/>
-        </w:rPr>
+          <w:rFonts w:ascii="Times New Roman" w:cs="Times New Roman" w:eastAsia="Times New Roman" w:hAnsi="Times New Roman"/>
+          <w:sz w:val="24"/>
+          <w:szCs w:val="24"/>
+          <w:highlight w:val="white"/>
+          <w:rtl w:val="0"/>
+        </w:rPr>
+        <w:t xml:space="preserve">We thank Dr. Susan Furth and CHOP’s Department of Biomedical and Health Informatics for their ongoing support, and Dr. Sarah Tasian for her guidance on cancer nomenclature review.</w:t>
       </w:r>
     </w:p>
     <w:p>
@@ -6832,14 +6843,8 @@
       </w:pPr>
       <w:r>
         <w:rPr>
-          <w:rFonts w:ascii="Times New Roman" w:cs="Times New Roman" w:eastAsia="Times New Roman" w:hAnsi="Times New Roman"/>
-          <w:b w:val="1"/>
-          <w:sz w:val="24"/>
-          <w:szCs w:val="24"/>
-          <w:highlight w:val="white"/>
-          <w:rtl w:val="0"/>
-        </w:rPr>
-        <w:t xml:space="preserve">Author contributions</w:t>
+          <w:rtl w:val="0"/>
+        </w:rPr>
       </w:r>
     </w:p>
     <w:p>
@@ -6849,6 +6854,7 @@
         <w:jc w:val="both"/>
         <w:rPr>
           <w:rFonts w:ascii="Times New Roman" w:cs="Times New Roman" w:eastAsia="Times New Roman" w:hAnsi="Times New Roman"/>
+          <w:b w:val="1"/>
           <w:sz w:val="24"/>
           <w:szCs w:val="24"/>
           <w:highlight w:val="white"/>
@@ -6857,50 +6863,13 @@
       <w:r>
         <w:rPr>
           <w:rFonts w:ascii="Times New Roman" w:cs="Times New Roman" w:eastAsia="Times New Roman" w:hAnsi="Times New Roman"/>
+          <w:b w:val="1"/>
           <w:sz w:val="24"/>
           <w:szCs w:val="24"/>
           <w:highlight w:val="white"/>
           <w:rtl w:val="0"/>
         </w:rPr>
-        <w:t xml:space="preserve">AL and DT conceived and designed the study. AL wrote the code. AL,SS, BS, TM performed the analyses. AL wrote the manuscript.  DT, EM, and KB made critical revisions to the manuscript. All authors interpreted the content, made revisions to the manuscript, and had final approval of the completed version. DT oversaw the project. DT acquired funding for the project.</w:t>
-      </w:r>
-    </w:p>
-    <w:p>
-      <w:pPr>
-        <w:ind w:left="-540" w:firstLine="0"/>
-        <w:jc w:val="both"/>
-        <w:rPr>
-          <w:rFonts w:ascii="Times New Roman" w:cs="Times New Roman" w:eastAsia="Times New Roman" w:hAnsi="Times New Roman"/>
-          <w:sz w:val="24"/>
-          <w:szCs w:val="24"/>
-        </w:rPr>
-      </w:pPr>
-      <w:r>
-        <w:rPr>
-          <w:rtl w:val="0"/>
-        </w:rPr>
-      </w:r>
-    </w:p>
-    <w:p>
-      <w:pPr>
-        <w:ind w:left="-540" w:firstLine="0"/>
-        <w:jc w:val="both"/>
-        <w:rPr>
-          <w:rFonts w:ascii="Times New Roman" w:cs="Times New Roman" w:eastAsia="Times New Roman" w:hAnsi="Times New Roman"/>
-          <w:b w:val="1"/>
-          <w:sz w:val="24"/>
-          <w:szCs w:val="24"/>
-        </w:rPr>
-      </w:pPr>
-      <w:r>
-        <w:rPr>
-          <w:rFonts w:ascii="Times New Roman" w:cs="Times New Roman" w:eastAsia="Times New Roman" w:hAnsi="Times New Roman"/>
-          <w:b w:val="1"/>
-          <w:sz w:val="24"/>
-          <w:szCs w:val="24"/>
-          <w:rtl w:val="0"/>
-        </w:rPr>
-        <w:t xml:space="preserve">Funding</w:t>
+        <w:t xml:space="preserve">Author contributions</w:t>
       </w:r>
     </w:p>
     <w:p>
@@ -6910,9 +6879,8 @@
         <w:jc w:val="both"/>
         <w:rPr>
           <w:rFonts w:ascii="Times New Roman" w:cs="Times New Roman" w:eastAsia="Times New Roman" w:hAnsi="Times New Roman"/>
-          <w:b w:val="1"/>
-          <w:sz w:val="28"/>
-          <w:szCs w:val="28"/>
+          <w:sz w:val="24"/>
+          <w:szCs w:val="24"/>
           <w:highlight w:val="white"/>
         </w:rPr>
       </w:pPr>
@@ -6924,23 +6892,17 @@
           <w:highlight w:val="white"/>
           <w:rtl w:val="0"/>
         </w:rPr>
-        <w:t xml:space="preserve">Dr. Taylor would like to acknowledge funding from the NIH Common Fund, through the Office of Strategic Coordination/Office of the NIH Director under award U2CHD109731. All other funding was provided by the Children’s Hospital of Philadelphia’s Research Institute.</w:t>
-      </w:r>
-      <w:r>
-        <w:rPr>
-          <w:rtl w:val="0"/>
-        </w:rPr>
+        <w:t xml:space="preserve">AL and DT conceived and designed the study. AL wrote the code. AL,SS, BS, TM performed the analyses. AL wrote the manuscript.  DT, EM, and KB made critical revisions to the manuscript. All authors interpreted the content, made revisions to the manuscript, and had final approval of the completed version. DT oversaw the project. DT acquired funding for the project.</w:t>
       </w:r>
     </w:p>
     <w:p>
       <w:pPr>
         <w:ind w:left="-540" w:firstLine="0"/>
-        <w:rPr>
-          <w:rFonts w:ascii="Times New Roman" w:cs="Times New Roman" w:eastAsia="Times New Roman" w:hAnsi="Times New Roman"/>
-          <w:b w:val="1"/>
-          <w:sz w:val="28"/>
-          <w:szCs w:val="28"/>
-          <w:highlight w:val="white"/>
+        <w:jc w:val="both"/>
+        <w:rPr>
+          <w:rFonts w:ascii="Times New Roman" w:cs="Times New Roman" w:eastAsia="Times New Roman" w:hAnsi="Times New Roman"/>
+          <w:sz w:val="24"/>
+          <w:szCs w:val="24"/>
         </w:rPr>
       </w:pPr>
       <w:r>
@@ -6951,14 +6913,13 @@
     </w:p>
     <w:p>
       <w:pPr>
-        <w:spacing w:line="276.0005454545455" w:lineRule="auto"/>
         <w:ind w:left="-540" w:firstLine="0"/>
+        <w:jc w:val="both"/>
         <w:rPr>
           <w:rFonts w:ascii="Times New Roman" w:cs="Times New Roman" w:eastAsia="Times New Roman" w:hAnsi="Times New Roman"/>
           <w:b w:val="1"/>
           <w:sz w:val="24"/>
           <w:szCs w:val="24"/>
-          <w:highlight w:val="white"/>
         </w:rPr>
       </w:pPr>
       <w:r>
@@ -6967,10 +6928,9 @@
           <w:b w:val="1"/>
           <w:sz w:val="24"/>
           <w:szCs w:val="24"/>
-          <w:highlight w:val="white"/>
-          <w:rtl w:val="0"/>
-        </w:rPr>
-        <w:t xml:space="preserve">Conflict of interests</w:t>
+          <w:rtl w:val="0"/>
+        </w:rPr>
+        <w:t xml:space="preserve">Funding</w:t>
       </w:r>
     </w:p>
     <w:p>
@@ -6989,13 +6949,12 @@
       <w:r>
         <w:rPr>
           <w:rFonts w:ascii="Times New Roman" w:cs="Times New Roman" w:eastAsia="Times New Roman" w:hAnsi="Times New Roman"/>
-          <w:color w:val="2e2e2e"/>
           <w:sz w:val="24"/>
           <w:szCs w:val="24"/>
           <w:highlight w:val="white"/>
           <w:rtl w:val="0"/>
         </w:rPr>
-        <w:t xml:space="preserve">The authors declare no competing interests.</w:t>
+        <w:t xml:space="preserve">Dr. Taylor would like to acknowledge funding from the NIH Common Fund, through the Office of Strategic Coordination/Office of the NIH Director under award U2CHD109731. All other funding was provided by the Children’s Hospital of Philadelphia’s Research Institute.</w:t>
       </w:r>
       <w:r>
         <w:rPr>
@@ -7022,9 +6981,11 @@
     </w:p>
     <w:p>
       <w:pPr>
+        <w:spacing w:line="276.0005454545455" w:lineRule="auto"/>
         <w:ind w:left="-540" w:firstLine="0"/>
         <w:rPr>
           <w:rFonts w:ascii="Times New Roman" w:cs="Times New Roman" w:eastAsia="Times New Roman" w:hAnsi="Times New Roman"/>
+          <w:b w:val="1"/>
           <w:sz w:val="24"/>
           <w:szCs w:val="24"/>
           <w:highlight w:val="white"/>
@@ -7039,128 +7000,7 @@
           <w:highlight w:val="white"/>
           <w:rtl w:val="0"/>
         </w:rPr>
-        <w:t xml:space="preserve">Data and code availability</w:t>
-      </w:r>
-      <w:r>
-        <w:rPr>
-          <w:rtl w:val="0"/>
-        </w:rPr>
-      </w:r>
-    </w:p>
-    <w:p>
-      <w:pPr>
-        <w:ind w:left="-540" w:firstLine="0"/>
-        <w:jc w:val="both"/>
-        <w:rPr>
-          <w:rFonts w:ascii="Times New Roman" w:cs="Times New Roman" w:eastAsia="Times New Roman" w:hAnsi="Times New Roman"/>
-          <w:sz w:val="24"/>
-          <w:szCs w:val="24"/>
-          <w:highlight w:val="white"/>
-        </w:rPr>
-      </w:pPr>
-      <w:r>
-        <w:rPr>
-          <w:rFonts w:ascii="Times New Roman" w:cs="Times New Roman" w:eastAsia="Times New Roman" w:hAnsi="Times New Roman"/>
-          <w:sz w:val="24"/>
-          <w:szCs w:val="24"/>
-          <w:highlight w:val="white"/>
-          <w:rtl w:val="0"/>
-        </w:rPr>
-        <w:t xml:space="preserve">Users can download the data used in this paper from the CTR website (</w:t>
-      </w:r>
-      <w:hyperlink r:id="rId81">
-        <w:r>
-          <w:rPr>
-            <w:rFonts w:ascii="Times New Roman" w:cs="Times New Roman" w:eastAsia="Times New Roman" w:hAnsi="Times New Roman"/>
-            <w:color w:val="1155cc"/>
-            <w:sz w:val="24"/>
-            <w:szCs w:val="24"/>
-            <w:highlight w:val="white"/>
-            <w:u w:val="single"/>
-            <w:rtl w:val="0"/>
-          </w:rPr>
-          <w:t xml:space="preserve">https://clinicaltrials.gov/</w:t>
-        </w:r>
-      </w:hyperlink>
-      <w:r>
-        <w:rPr>
-          <w:rFonts w:ascii="Times New Roman" w:cs="Times New Roman" w:eastAsia="Times New Roman" w:hAnsi="Times New Roman"/>
-          <w:sz w:val="24"/>
-          <w:szCs w:val="24"/>
-          <w:highlight w:val="white"/>
-          <w:rtl w:val="0"/>
-        </w:rPr>
-        <w:t xml:space="preserve">)</w:t>
-      </w:r>
-      <w:hyperlink r:id="rId82">
-        <w:r>
-          <w:rPr>
-            <w:rFonts w:ascii="Times New Roman" w:cs="Times New Roman" w:eastAsia="Times New Roman" w:hAnsi="Times New Roman"/>
-            <w:b w:val="0"/>
-            <w:color w:val="000000"/>
-            <w:sz w:val="24"/>
-            <w:szCs w:val="24"/>
-            <w:highlight w:val="white"/>
-            <w:u w:val="none"/>
-            <w:rtl w:val="0"/>
-          </w:rPr>
-          <w:t xml:space="preserve">[10]</w:t>
-        </w:r>
-      </w:hyperlink>
-      <w:r>
-        <w:rPr>
-          <w:rFonts w:ascii="Times New Roman" w:cs="Times New Roman" w:eastAsia="Times New Roman" w:hAnsi="Times New Roman"/>
-          <w:sz w:val="24"/>
-          <w:szCs w:val="24"/>
-          <w:highlight w:val="white"/>
-          <w:rtl w:val="0"/>
-        </w:rPr>
-        <w:t xml:space="preserve">, Clinical Trials API or from the Aggregate Analysis of ClinicalTrials.gov-Clinical Trials Transformative Initiative (AACT-CTTI) website (</w:t>
-      </w:r>
-      <w:hyperlink r:id="rId83">
-        <w:r>
-          <w:rPr>
-            <w:rFonts w:ascii="Times New Roman" w:cs="Times New Roman" w:eastAsia="Times New Roman" w:hAnsi="Times New Roman"/>
-            <w:color w:val="1155cc"/>
-            <w:sz w:val="24"/>
-            <w:szCs w:val="24"/>
-            <w:highlight w:val="white"/>
-            <w:u w:val="single"/>
-            <w:rtl w:val="0"/>
-          </w:rPr>
-          <w:t xml:space="preserve">https://aact.ctti-clinicaltrials.org/download</w:t>
-        </w:r>
-      </w:hyperlink>
-      <w:r>
-        <w:rPr>
-          <w:rFonts w:ascii="Times New Roman" w:cs="Times New Roman" w:eastAsia="Times New Roman" w:hAnsi="Times New Roman"/>
-          <w:sz w:val="24"/>
-          <w:szCs w:val="24"/>
-          <w:highlight w:val="white"/>
-          <w:rtl w:val="0"/>
-        </w:rPr>
-        <w:t xml:space="preserve">). We downloaded a copy of the database from the ACCT-CTTI website on August 22, 2023 which is available as a zip file titled “20230822_export.zip” under the section titled “Monthly Archive of Static Copies”.  The AACT-CTTI website is updated daily with content from ClinicalTrials.gov and provides a static database at the beginning of each month. This database includes information on all registered studies in the CTR, with details about clinical trials, such as experimental design, conditions, and interventions, available in separate pipe-delimited text files within the zip file. The process for downloading the dataset used in this study is outlined in </w:t>
-      </w:r>
-      <w:r>
-        <w:rPr>
-          <w:rFonts w:ascii="Times New Roman" w:cs="Times New Roman" w:eastAsia="Times New Roman" w:hAnsi="Times New Roman"/>
-          <w:b w:val="1"/>
-          <w:sz w:val="24"/>
-          <w:szCs w:val="24"/>
-          <w:highlight w:val="white"/>
-          <w:rtl w:val="0"/>
-        </w:rPr>
-        <w:t xml:space="preserve">Supplementary Document SD6</w:t>
-      </w:r>
-      <w:r>
-        <w:rPr>
-          <w:rFonts w:ascii="Times New Roman" w:cs="Times New Roman" w:eastAsia="Times New Roman" w:hAnsi="Times New Roman"/>
-          <w:sz w:val="24"/>
-          <w:szCs w:val="24"/>
-          <w:highlight w:val="white"/>
-          <w:rtl w:val="0"/>
-        </w:rPr>
-        <w:t xml:space="preserve">. </w:t>
+        <w:t xml:space="preserve">Conflict of interests</w:t>
       </w:r>
     </w:p>
     <w:p>
@@ -7170,16 +7010,187 @@
         <w:jc w:val="both"/>
         <w:rPr>
           <w:rFonts w:ascii="Times New Roman" w:cs="Times New Roman" w:eastAsia="Times New Roman" w:hAnsi="Times New Roman"/>
+          <w:b w:val="1"/>
+          <w:sz w:val="28"/>
+          <w:szCs w:val="28"/>
+          <w:highlight w:val="white"/>
+        </w:rPr>
+      </w:pPr>
+      <w:r>
+        <w:rPr>
+          <w:rFonts w:ascii="Times New Roman" w:cs="Times New Roman" w:eastAsia="Times New Roman" w:hAnsi="Times New Roman"/>
           <w:color w:val="2e2e2e"/>
           <w:sz w:val="24"/>
           <w:szCs w:val="24"/>
           <w:highlight w:val="white"/>
+          <w:rtl w:val="0"/>
+        </w:rPr>
+        <w:t xml:space="preserve">The authors declare no competing interests.</w:t>
+      </w:r>
+      <w:r>
+        <w:rPr>
+          <w:rtl w:val="0"/>
+        </w:rPr>
+      </w:r>
+    </w:p>
+    <w:p>
+      <w:pPr>
+        <w:ind w:left="-540" w:firstLine="0"/>
+        <w:rPr>
+          <w:rFonts w:ascii="Times New Roman" w:cs="Times New Roman" w:eastAsia="Times New Roman" w:hAnsi="Times New Roman"/>
+          <w:b w:val="1"/>
+          <w:sz w:val="28"/>
+          <w:szCs w:val="28"/>
+          <w:highlight w:val="white"/>
         </w:rPr>
       </w:pPr>
       <w:r>
         <w:rPr>
           <w:rtl w:val="0"/>
         </w:rPr>
+      </w:r>
+    </w:p>
+    <w:p>
+      <w:pPr>
+        <w:ind w:left="-540" w:firstLine="0"/>
+        <w:rPr>
+          <w:rFonts w:ascii="Times New Roman" w:cs="Times New Roman" w:eastAsia="Times New Roman" w:hAnsi="Times New Roman"/>
+          <w:sz w:val="24"/>
+          <w:szCs w:val="24"/>
+          <w:highlight w:val="white"/>
+        </w:rPr>
+      </w:pPr>
+      <w:r>
+        <w:rPr>
+          <w:rFonts w:ascii="Times New Roman" w:cs="Times New Roman" w:eastAsia="Times New Roman" w:hAnsi="Times New Roman"/>
+          <w:b w:val="1"/>
+          <w:sz w:val="24"/>
+          <w:szCs w:val="24"/>
+          <w:highlight w:val="white"/>
+          <w:rtl w:val="0"/>
+        </w:rPr>
+        <w:t xml:space="preserve">Data and code availability</w:t>
+      </w:r>
+      <w:r>
+        <w:rPr>
+          <w:rtl w:val="0"/>
+        </w:rPr>
+      </w:r>
+    </w:p>
+    <w:p>
+      <w:pPr>
+        <w:ind w:left="-540" w:firstLine="0"/>
+        <w:jc w:val="both"/>
+        <w:rPr>
+          <w:rFonts w:ascii="Times New Roman" w:cs="Times New Roman" w:eastAsia="Times New Roman" w:hAnsi="Times New Roman"/>
+          <w:sz w:val="24"/>
+          <w:szCs w:val="24"/>
+          <w:highlight w:val="white"/>
+        </w:rPr>
+      </w:pPr>
+      <w:r>
+        <w:rPr>
+          <w:rFonts w:ascii="Times New Roman" w:cs="Times New Roman" w:eastAsia="Times New Roman" w:hAnsi="Times New Roman"/>
+          <w:sz w:val="24"/>
+          <w:szCs w:val="24"/>
+          <w:highlight w:val="white"/>
+          <w:rtl w:val="0"/>
+        </w:rPr>
+        <w:t xml:space="preserve">Users can download the data used in this paper from the CTR website (</w:t>
+      </w:r>
+      <w:hyperlink r:id="rId81">
+        <w:r>
+          <w:rPr>
+            <w:rFonts w:ascii="Times New Roman" w:cs="Times New Roman" w:eastAsia="Times New Roman" w:hAnsi="Times New Roman"/>
+            <w:color w:val="1155cc"/>
+            <w:sz w:val="24"/>
+            <w:szCs w:val="24"/>
+            <w:highlight w:val="white"/>
+            <w:u w:val="single"/>
+            <w:rtl w:val="0"/>
+          </w:rPr>
+          <w:t xml:space="preserve">https://clinicaltrials.gov/</w:t>
+        </w:r>
+      </w:hyperlink>
+      <w:r>
+        <w:rPr>
+          <w:rFonts w:ascii="Times New Roman" w:cs="Times New Roman" w:eastAsia="Times New Roman" w:hAnsi="Times New Roman"/>
+          <w:sz w:val="24"/>
+          <w:szCs w:val="24"/>
+          <w:highlight w:val="white"/>
+          <w:rtl w:val="0"/>
+        </w:rPr>
+        <w:t xml:space="preserve">)</w:t>
+      </w:r>
+      <w:hyperlink r:id="rId82">
+        <w:r>
+          <w:rPr>
+            <w:rFonts w:ascii="Times New Roman" w:cs="Times New Roman" w:eastAsia="Times New Roman" w:hAnsi="Times New Roman"/>
+            <w:b w:val="0"/>
+            <w:color w:val="000000"/>
+            <w:sz w:val="24"/>
+            <w:szCs w:val="24"/>
+            <w:highlight w:val="white"/>
+            <w:u w:val="none"/>
+            <w:rtl w:val="0"/>
+          </w:rPr>
+          <w:t xml:space="preserve">[10]</w:t>
+        </w:r>
+      </w:hyperlink>
+      <w:r>
+        <w:rPr>
+          <w:rFonts w:ascii="Times New Roman" w:cs="Times New Roman" w:eastAsia="Times New Roman" w:hAnsi="Times New Roman"/>
+          <w:sz w:val="24"/>
+          <w:szCs w:val="24"/>
+          <w:highlight w:val="white"/>
+          <w:rtl w:val="0"/>
+        </w:rPr>
+        <w:t xml:space="preserve">, Clinical Trials API or from the Aggregate Analysis of ClinicalTrials.gov-Clinical Trials Transformative Initiative (AACT-CTTI) website (</w:t>
+      </w:r>
+      <w:hyperlink r:id="rId83">
+        <w:r>
+          <w:rPr>
+            <w:rFonts w:ascii="Times New Roman" w:cs="Times New Roman" w:eastAsia="Times New Roman" w:hAnsi="Times New Roman"/>
+            <w:color w:val="1155cc"/>
+            <w:sz w:val="24"/>
+            <w:szCs w:val="24"/>
+            <w:highlight w:val="white"/>
+            <w:u w:val="single"/>
+            <w:rtl w:val="0"/>
+          </w:rPr>
+          <w:t xml:space="preserve">https://aact.ctti-clinicaltrials.org/download</w:t>
+        </w:r>
+      </w:hyperlink>
+      <w:r>
+        <w:rPr>
+          <w:rFonts w:ascii="Times New Roman" w:cs="Times New Roman" w:eastAsia="Times New Roman" w:hAnsi="Times New Roman"/>
+          <w:sz w:val="24"/>
+          <w:szCs w:val="24"/>
+          <w:highlight w:val="white"/>
+          <w:rtl w:val="0"/>
+        </w:rPr>
+        <w:t xml:space="preserve">). We downloaded a copy of the database from the ACCT-CTTI website on August 22, 2023 which is available as a zip file titled “20230822_export.zip” under the section titled “Monthly Archive of Static Copies”.  The AACT-CTTI website is updated daily with content from ClinicalTrials.gov and provides a static database at the beginning of each month. This database includes information on all registered studies in the CTR, with details about clinical trials, such as experimental design, conditions, and interventions, available in separate pipe-delimited text files within the zip file. The process for downloading the dataset used in this study is outlined in </w:t>
+      </w:r>
+      <w:r>
+        <w:rPr>
+          <w:rFonts w:ascii="Times New Roman" w:cs="Times New Roman" w:eastAsia="Times New Roman" w:hAnsi="Times New Roman"/>
+          <w:b w:val="1"/>
+          <w:sz w:val="24"/>
+          <w:szCs w:val="24"/>
+          <w:highlight w:val="white"/>
+          <w:rtl w:val="0"/>
+        </w:rPr>
+        <w:t xml:space="preserve">Supplementary Document SD6</w:t>
+      </w:r>
+      <w:r>
+        <w:rPr>
+          <w:rFonts w:ascii="Times New Roman" w:cs="Times New Roman" w:eastAsia="Times New Roman" w:hAnsi="Times New Roman"/>
+          <w:sz w:val="24"/>
+          <w:szCs w:val="24"/>
+          <w:highlight w:val="white"/>
+          <w:rtl w:val="0"/>
+        </w:rPr>
+        <w:t xml:space="preserve">. </w:t>
       </w:r>
     </w:p>
     <w:p>
@@ -7189,6 +7200,7 @@
         <w:jc w:val="both"/>
         <w:rPr>
           <w:rFonts w:ascii="Times New Roman" w:cs="Times New Roman" w:eastAsia="Times New Roman" w:hAnsi="Times New Roman"/>
+          <w:color w:val="2e2e2e"/>
           <w:sz w:val="24"/>
           <w:szCs w:val="24"/>
           <w:highlight w:val="white"/>
@@ -7196,103 +7208,8 @@
       </w:pPr>
       <w:r>
         <w:rPr>
-          <w:rFonts w:ascii="Times New Roman" w:cs="Times New Roman" w:eastAsia="Times New Roman" w:hAnsi="Times New Roman"/>
-          <w:color w:val="2e2e2e"/>
-          <w:sz w:val="24"/>
-          <w:szCs w:val="24"/>
-          <w:highlight w:val="white"/>
-          <w:rtl w:val="0"/>
-        </w:rPr>
-        <w:t xml:space="preserve">The WHO </w:t>
-      </w:r>
-      <w:r>
-        <w:rPr>
-          <w:rFonts w:ascii="Times New Roman" w:cs="Times New Roman" w:eastAsia="Times New Roman" w:hAnsi="Times New Roman"/>
-          <w:color w:val="2a2a2a"/>
-          <w:sz w:val="24"/>
-          <w:szCs w:val="24"/>
-          <w:highlight w:val="white"/>
-          <w:rtl w:val="0"/>
-        </w:rPr>
-        <w:t xml:space="preserve">system</w:t>
-      </w:r>
-      <w:r>
-        <w:rPr>
-          <w:rFonts w:ascii="Times New Roman" w:cs="Times New Roman" w:eastAsia="Times New Roman" w:hAnsi="Times New Roman"/>
-          <w:sz w:val="24"/>
-          <w:szCs w:val="24"/>
-          <w:highlight w:val="white"/>
-          <w:rtl w:val="0"/>
-        </w:rPr>
-        <w:t xml:space="preserve"> </w:t>
-      </w:r>
-      <w:r>
-        <w:rPr>
-          <w:rFonts w:ascii="Times New Roman" w:cs="Times New Roman" w:eastAsia="Times New Roman" w:hAnsi="Times New Roman"/>
-          <w:color w:val="2e2e2e"/>
-          <w:sz w:val="24"/>
-          <w:szCs w:val="24"/>
-          <w:highlight w:val="white"/>
-          <w:rtl w:val="0"/>
-        </w:rPr>
-        <w:t xml:space="preserve">and NCIt database standardized tumor names generated by CANTOS are available in </w:t>
-      </w:r>
-      <w:r>
-        <w:rPr>
-          <w:rFonts w:ascii="Times New Roman" w:cs="Times New Roman" w:eastAsia="Times New Roman" w:hAnsi="Times New Roman"/>
-          <w:b w:val="1"/>
-          <w:color w:val="2e2e2e"/>
-          <w:sz w:val="24"/>
-          <w:szCs w:val="24"/>
-          <w:highlight w:val="white"/>
-          <w:rtl w:val="0"/>
-        </w:rPr>
-        <w:t xml:space="preserve">Supplementary Tables ST6-ST9</w:t>
-      </w:r>
-      <w:r>
-        <w:rPr>
-          <w:rFonts w:ascii="Times New Roman" w:cs="Times New Roman" w:eastAsia="Times New Roman" w:hAnsi="Times New Roman"/>
-          <w:color w:val="2e2e2e"/>
-          <w:sz w:val="24"/>
-          <w:szCs w:val="24"/>
-          <w:highlight w:val="white"/>
-          <w:rtl w:val="0"/>
-        </w:rPr>
-        <w:t xml:space="preserve">. </w:t>
-      </w:r>
-      <w:r>
-        <w:rPr>
-          <w:rFonts w:ascii="Times New Roman" w:cs="Times New Roman" w:eastAsia="Times New Roman" w:hAnsi="Times New Roman"/>
-          <w:sz w:val="24"/>
-          <w:szCs w:val="24"/>
-          <w:highlight w:val="white"/>
-          <w:rtl w:val="0"/>
-        </w:rPr>
-        <w:t xml:space="preserve">The code files for building and running CANTOS, along with the instructions for downloading the embeddings are publicly available at the GitHub repository: </w:t>
-      </w:r>
-      <w:hyperlink r:id="rId84">
-        <w:r>
-          <w:rPr>
-            <w:rFonts w:ascii="Times New Roman" w:cs="Times New Roman" w:eastAsia="Times New Roman" w:hAnsi="Times New Roman"/>
-            <w:color w:val="1155cc"/>
-            <w:sz w:val="24"/>
-            <w:szCs w:val="24"/>
-            <w:highlight w:val="white"/>
-            <w:u w:val="single"/>
-            <w:rtl w:val="0"/>
-          </w:rPr>
-          <w:t xml:space="preserve">https://github.com/TaylorResearchLab/CANTOS</w:t>
-        </w:r>
-      </w:hyperlink>
-      <w:r>
-        <w:rPr>
-          <w:rFonts w:ascii="Times New Roman" w:cs="Times New Roman" w:eastAsia="Times New Roman" w:hAnsi="Times New Roman"/>
-          <w:sz w:val="24"/>
-          <w:szCs w:val="24"/>
-          <w:highlight w:val="white"/>
-          <w:rtl w:val="0"/>
-        </w:rPr>
-        <w:t xml:space="preserve">.</w:t>
+          <w:rtl w:val="0"/>
+        </w:rPr>
       </w:r>
     </w:p>
     <w:p>
@@ -7302,16 +7219,110 @@
         <w:jc w:val="both"/>
         <w:rPr>
           <w:rFonts w:ascii="Times New Roman" w:cs="Times New Roman" w:eastAsia="Times New Roman" w:hAnsi="Times New Roman"/>
+          <w:sz w:val="24"/>
+          <w:szCs w:val="24"/>
+          <w:highlight w:val="white"/>
+        </w:rPr>
+      </w:pPr>
+      <w:r>
+        <w:rPr>
+          <w:rFonts w:ascii="Times New Roman" w:cs="Times New Roman" w:eastAsia="Times New Roman" w:hAnsi="Times New Roman"/>
           <w:color w:val="2e2e2e"/>
           <w:sz w:val="24"/>
           <w:szCs w:val="24"/>
           <w:highlight w:val="white"/>
-        </w:rPr>
-      </w:pPr>
-      <w:r>
-        <w:rPr>
-          <w:rtl w:val="0"/>
-        </w:rPr>
+          <w:rtl w:val="0"/>
+        </w:rPr>
+        <w:t xml:space="preserve">The WHO </w:t>
+      </w:r>
+      <w:r>
+        <w:rPr>
+          <w:rFonts w:ascii="Times New Roman" w:cs="Times New Roman" w:eastAsia="Times New Roman" w:hAnsi="Times New Roman"/>
+          <w:color w:val="2a2a2a"/>
+          <w:sz w:val="24"/>
+          <w:szCs w:val="24"/>
+          <w:highlight w:val="white"/>
+          <w:rtl w:val="0"/>
+        </w:rPr>
+        <w:t xml:space="preserve">system</w:t>
+      </w:r>
+      <w:r>
+        <w:rPr>
+          <w:rFonts w:ascii="Times New Roman" w:cs="Times New Roman" w:eastAsia="Times New Roman" w:hAnsi="Times New Roman"/>
+          <w:sz w:val="24"/>
+          <w:szCs w:val="24"/>
+          <w:highlight w:val="white"/>
+          <w:rtl w:val="0"/>
+        </w:rPr>
+        <w:t xml:space="preserve"> </w:t>
+      </w:r>
+      <w:r>
+        <w:rPr>
+          <w:rFonts w:ascii="Times New Roman" w:cs="Times New Roman" w:eastAsia="Times New Roman" w:hAnsi="Times New Roman"/>
+          <w:color w:val="2e2e2e"/>
+          <w:sz w:val="24"/>
+          <w:szCs w:val="24"/>
+          <w:highlight w:val="white"/>
+          <w:rtl w:val="0"/>
+        </w:rPr>
+        <w:t xml:space="preserve">and NCIt database standardized tumor names generated by CANTOS are available in </w:t>
+      </w:r>
+      <w:r>
+        <w:rPr>
+          <w:rFonts w:ascii="Times New Roman" w:cs="Times New Roman" w:eastAsia="Times New Roman" w:hAnsi="Times New Roman"/>
+          <w:b w:val="1"/>
+          <w:color w:val="2e2e2e"/>
+          <w:sz w:val="24"/>
+          <w:szCs w:val="24"/>
+          <w:highlight w:val="white"/>
+          <w:rtl w:val="0"/>
+        </w:rPr>
+        <w:t xml:space="preserve">Supplementary Tables ST6-ST9</w:t>
+      </w:r>
+      <w:r>
+        <w:rPr>
+          <w:rFonts w:ascii="Times New Roman" w:cs="Times New Roman" w:eastAsia="Times New Roman" w:hAnsi="Times New Roman"/>
+          <w:color w:val="2e2e2e"/>
+          <w:sz w:val="24"/>
+          <w:szCs w:val="24"/>
+          <w:highlight w:val="white"/>
+          <w:rtl w:val="0"/>
+        </w:rPr>
+        <w:t xml:space="preserve">. </w:t>
+      </w:r>
+      <w:r>
+        <w:rPr>
+          <w:rFonts w:ascii="Times New Roman" w:cs="Times New Roman" w:eastAsia="Times New Roman" w:hAnsi="Times New Roman"/>
+          <w:sz w:val="24"/>
+          <w:szCs w:val="24"/>
+          <w:highlight w:val="white"/>
+          <w:rtl w:val="0"/>
+        </w:rPr>
+        <w:t xml:space="preserve">The code files for building and running CANTOS, along with the instructions for downloading the embeddings are publicly available at the GitHub repository: </w:t>
+      </w:r>
+      <w:hyperlink r:id="rId84">
+        <w:r>
+          <w:rPr>
+            <w:rFonts w:ascii="Times New Roman" w:cs="Times New Roman" w:eastAsia="Times New Roman" w:hAnsi="Times New Roman"/>
+            <w:color w:val="1155cc"/>
+            <w:sz w:val="24"/>
+            <w:szCs w:val="24"/>
+            <w:highlight w:val="white"/>
+            <w:u w:val="single"/>
+            <w:rtl w:val="0"/>
+          </w:rPr>
+          <w:t xml:space="preserve">https://github.com/TaylorResearchLab/CANTOS</w:t>
+        </w:r>
+      </w:hyperlink>
+      <w:r>
+        <w:rPr>
+          <w:rFonts w:ascii="Times New Roman" w:cs="Times New Roman" w:eastAsia="Times New Roman" w:hAnsi="Times New Roman"/>
+          <w:sz w:val="24"/>
+          <w:szCs w:val="24"/>
+          <w:highlight w:val="white"/>
+          <w:rtl w:val="0"/>
+        </w:rPr>
+        <w:t xml:space="preserve">.</w:t>
       </w:r>
     </w:p>
     <w:p>
@@ -7321,7 +7332,7 @@
         <w:jc w:val="both"/>
         <w:rPr>
           <w:rFonts w:ascii="Times New Roman" w:cs="Times New Roman" w:eastAsia="Times New Roman" w:hAnsi="Times New Roman"/>
-          <w:b w:val="1"/>
+          <w:color w:val="2e2e2e"/>
           <w:sz w:val="24"/>
           <w:szCs w:val="24"/>
           <w:highlight w:val="white"/>
@@ -7329,14 +7340,8 @@
       </w:pPr>
       <w:r>
         <w:rPr>
-          <w:rFonts w:ascii="Times New Roman" w:cs="Times New Roman" w:eastAsia="Times New Roman" w:hAnsi="Times New Roman"/>
-          <w:b w:val="1"/>
-          <w:sz w:val="24"/>
-          <w:szCs w:val="24"/>
-          <w:highlight w:val="white"/>
-          <w:rtl w:val="0"/>
-        </w:rPr>
-        <w:t xml:space="preserve">Declaration of generative AI and AI-assisted technologies in the writing process</w:t>
+          <w:rtl w:val="0"/>
+        </w:rPr>
       </w:r>
     </w:p>
     <w:p>
@@ -7345,22 +7350,60 @@
         <w:ind w:left="-540" w:firstLine="0"/>
         <w:jc w:val="both"/>
         <w:rPr>
+          <w:rFonts w:ascii="Times New Roman" w:cs="Times New Roman" w:eastAsia="Times New Roman" w:hAnsi="Times New Roman"/>
           <w:b w:val="1"/>
-          <w:sz w:val="28"/>
-          <w:szCs w:val="28"/>
+          <w:sz w:val="24"/>
+          <w:szCs w:val="24"/>
           <w:highlight w:val="white"/>
         </w:rPr>
       </w:pPr>
       <w:r>
         <w:rPr>
           <w:rFonts w:ascii="Times New Roman" w:cs="Times New Roman" w:eastAsia="Times New Roman" w:hAnsi="Times New Roman"/>
+          <w:b w:val="1"/>
           <w:sz w:val="24"/>
           <w:szCs w:val="24"/>
           <w:highlight w:val="white"/>
           <w:rtl w:val="0"/>
         </w:rPr>
+        <w:t xml:space="preserve">Declaration of generative AI and AI-assisted technologies in the writing process</w:t>
+      </w:r>
+    </w:p>
+    <w:p>
+      <w:pPr>
+        <w:spacing w:line="276.0005454545455" w:lineRule="auto"/>
+        <w:ind w:left="-540" w:firstLine="0"/>
+        <w:jc w:val="both"/>
+        <w:rPr>
+          <w:rFonts w:ascii="Times New Roman" w:cs="Times New Roman" w:eastAsia="Times New Roman" w:hAnsi="Times New Roman"/>
+          <w:sz w:val="24"/>
+          <w:szCs w:val="24"/>
+          <w:highlight w:val="white"/>
+        </w:rPr>
+      </w:pPr>
+      <w:r>
+        <w:rPr>
+          <w:rFonts w:ascii="Times New Roman" w:cs="Times New Roman" w:eastAsia="Times New Roman" w:hAnsi="Times New Roman"/>
+          <w:sz w:val="24"/>
+          <w:szCs w:val="24"/>
+          <w:highlight w:val="white"/>
+          <w:rtl w:val="0"/>
+        </w:rPr>
         <w:t xml:space="preserve">During the preparation of this work the authors used ChatGPT 4.0 and Grammarly to improve clarity and conciseness of the written text. After using these services, the authors reviewed and edited the content as needed and take full responsibility for the content of the publication.</w:t>
       </w:r>
+    </w:p>
+    <w:p>
+      <w:pPr>
+        <w:spacing w:line="276.0005454545455" w:lineRule="auto"/>
+        <w:ind w:left="-540" w:firstLine="0"/>
+        <w:jc w:val="both"/>
+        <w:rPr>
+          <w:rFonts w:ascii="Times New Roman" w:cs="Times New Roman" w:eastAsia="Times New Roman" w:hAnsi="Times New Roman"/>
+          <w:sz w:val="24"/>
+          <w:szCs w:val="24"/>
+          <w:highlight w:val="white"/>
+        </w:rPr>
+      </w:pPr>
       <w:r>
         <w:rPr>
           <w:rtl w:val="0"/>
@@ -40838,12 +40881,12 @@
           <wp:inline distB="114300" distT="114300" distL="114300" distR="114300">
             <wp:extent cx="7217045" cy="4254901"/>
             <wp:effectExtent b="0" l="0" r="0" t="0"/>
-            <wp:docPr id="5" name="image3.png"/>
+            <wp:docPr id="5" name="image5.png"/>
             <a:graphic>
               <a:graphicData uri="http://schemas.openxmlformats.org/drawingml/2006/picture">
                 <pic:pic>
                   <pic:nvPicPr>
-                    <pic:cNvPr id="0" name="image3.png"/>
+                    <pic:cNvPr id="0" name="image5.png"/>
                     <pic:cNvPicPr preferRelativeResize="0"/>
                   </pic:nvPicPr>
                   <pic:blipFill>
@@ -40945,12 +40988,12 @@
           <wp:inline distB="114300" distT="114300" distL="114300" distR="114300">
             <wp:extent cx="6619875" cy="6841182"/>
             <wp:effectExtent b="0" l="0" r="0" t="0"/>
-            <wp:docPr id="2" name="image5.png"/>
+            <wp:docPr id="2" name="image6.png"/>
             <a:graphic>
               <a:graphicData uri="http://schemas.openxmlformats.org/drawingml/2006/picture">
                 <pic:pic>
                   <pic:nvPicPr>
-                    <pic:cNvPr id="0" name="image5.png"/>
+                    <pic:cNvPr id="0" name="image6.png"/>
                     <pic:cNvPicPr preferRelativeResize="0"/>
                   </pic:nvPicPr>
                   <pic:blipFill>
@@ -41084,12 +41127,12 @@
           <wp:inline distB="114300" distT="114300" distL="114300" distR="114300">
             <wp:extent cx="5617464" cy="4225796"/>
             <wp:effectExtent b="0" l="0" r="0" t="0"/>
-            <wp:docPr id="4" name="image2.png"/>
+            <wp:docPr id="4" name="image4.png"/>
             <a:graphic>
               <a:graphicData uri="http://schemas.openxmlformats.org/drawingml/2006/picture">
                 <pic:pic>
                   <pic:nvPicPr>
-                    <pic:cNvPr id="0" name="image2.png"/>
+                    <pic:cNvPr id="0" name="image4.png"/>
                     <pic:cNvPicPr preferRelativeResize="0"/>
                   </pic:nvPicPr>
                   <pic:blipFill>
@@ -41268,12 +41311,12 @@
           <wp:inline distB="114300" distT="114300" distL="114300" distR="114300">
             <wp:extent cx="5893689" cy="4442331"/>
             <wp:effectExtent b="0" l="0" r="0" t="0"/>
-            <wp:docPr id="3" name="image4.png"/>
+            <wp:docPr id="3" name="image1.png"/>
             <a:graphic>
               <a:graphicData uri="http://schemas.openxmlformats.org/drawingml/2006/picture">
                 <pic:pic>
                   <pic:nvPicPr>
-                    <pic:cNvPr id="0" name="image4.png"/>
+                    <pic:cNvPr id="0" name="image1.png"/>
                     <pic:cNvPicPr preferRelativeResize="0"/>
                   </pic:nvPicPr>
                   <pic:blipFill>
@@ -41413,12 +41456,12 @@
           <wp:inline distB="114300" distT="114300" distL="114300" distR="114300">
             <wp:extent cx="6303264" cy="3057525"/>
             <wp:effectExtent b="0" l="0" r="0" t="0"/>
-            <wp:docPr id="6" name="image1.png"/>
+            <wp:docPr id="6" name="image2.png"/>
             <a:graphic>
               <a:graphicData uri="http://schemas.openxmlformats.org/drawingml/2006/picture">
                 <pic:pic>
                   <pic:nvPicPr>
-                    <pic:cNvPr id="0" name="image1.png"/>
+                    <pic:cNvPr id="0" name="image2.png"/>
                     <pic:cNvPicPr preferRelativeResize="0"/>
                   </pic:nvPicPr>
                   <pic:blipFill>
@@ -41564,12 +41607,12 @@
           <wp:inline distB="114300" distT="114300" distL="114300" distR="114300">
             <wp:extent cx="7170039" cy="3133725"/>
             <wp:effectExtent b="0" l="0" r="0" t="0"/>
-            <wp:docPr id="1" name="image6.png"/>
+            <wp:docPr id="1" name="image3.png"/>
             <a:graphic>
               <a:graphicData uri="http://schemas.openxmlformats.org/drawingml/2006/picture">
                 <pic:pic>
                   <pic:nvPicPr>
-                    <pic:cNvPr id="0" name="image6.png"/>
+                    <pic:cNvPr id="0" name="image3.png"/>
                     <pic:cNvPicPr preferRelativeResize="0"/>
                   </pic:nvPicPr>
                   <pic:blipFill>

</xml_diff>